<commit_message>
Website: bump to scrum cleanup (drop /scrum/devops, refresh sprints+meetings)
</commit_message>
<xml_diff>
--- a/docs/v2/out/DataCycle_User_Guide.docx
+++ b/docs/v2/out/DataCycle_User_Guide.docx
@@ -10,7 +10,6 @@
           <w:docPartUnique/>
         </w:docPartObj>
       </w:sdtPr>
-      <w:sdtEndPr/>
       <w:sdtContent>
         <w:p/>
         <w:tbl>
@@ -42,9 +41,8 @@
               </w:tcPr>
               <w:p>
                 <w:pPr>
-                  <w:pStyle w:val="Sansinterligne"/>
+                  <w:pStyle w:val="NoSpacing"/>
                   <w:rPr>
-                    <w:sz w:val="24"/>
                     <w:lang w:val="en-US"/>
                   </w:rPr>
                 </w:pPr>
@@ -59,9 +57,6 @@
               <w:sdt>
                 <w:sdtPr>
                   <w:rPr>
-                    <w:rFonts w:asciiTheme="majorHAnsi" w:eastAsiaTheme="majorEastAsia" w:hAnsiTheme="majorHAnsi" w:cstheme="majorBidi"/>
-                    <w:sz w:val="88"/>
-                    <w:szCs w:val="88"/>
                     <w:lang w:val="en-US"/>
                   </w:rPr>
                   <w:alias w:val="Titre"/>
@@ -72,24 +67,17 @@
                   <w:dataBinding w:prefixMappings="xmlns:ns0='http://schemas.openxmlformats.org/package/2006/metadata/core-properties' xmlns:ns1='http://purl.org/dc/elements/1.1/'" w:xpath="/ns0:coreProperties[1]/ns1:title[1]" w:storeItemID="{6C3C8BC8-F283-45AE-878A-BAB7291924A1}"/>
                   <w:text/>
                 </w:sdtPr>
-                <w:sdtEndPr/>
                 <w:sdtContent>
                   <w:p>
                     <w:pPr>
-                      <w:pStyle w:val="Sansinterligne"/>
+                      <w:pStyle w:val="NoSpacing"/>
                       <w:spacing w:line="216" w:lineRule="auto"/>
                       <w:rPr>
-                        <w:rFonts w:asciiTheme="majorHAnsi" w:eastAsiaTheme="majorEastAsia" w:hAnsiTheme="majorHAnsi" w:cstheme="majorBidi"/>
-                        <w:sz w:val="88"/>
-                        <w:szCs w:val="88"/>
                         <w:lang w:val="en-US"/>
                       </w:rPr>
                     </w:pPr>
                     <w:r>
                       <w:rPr>
-                        <w:rFonts w:asciiTheme="majorHAnsi" w:eastAsiaTheme="majorEastAsia" w:hAnsiTheme="majorHAnsi" w:cstheme="majorBidi"/>
-                        <w:sz w:val="88"/>
-                        <w:szCs w:val="88"/>
                         <w:lang w:val="en-US"/>
                       </w:rPr>
                       <w:t>Data cycle - User guide</w:t>
@@ -103,8 +91,6 @@
             <w:sdt>
               <w:sdtPr>
                 <w:rPr>
-                  <w:sz w:val="28"/>
-                  <w:szCs w:val="28"/>
                   <w:lang w:val="en-US"/>
                 </w:rPr>
                 <w:alias w:val="Sous-titre"/>
@@ -115,7 +101,6 @@
                 <w:dataBinding w:prefixMappings="xmlns:ns0='http://schemas.openxmlformats.org/package/2006/metadata/core-properties' xmlns:ns1='http://purl.org/dc/elements/1.1/'" w:xpath="/ns0:coreProperties[1]/ns1:subject[1]" w:storeItemID="{6C3C8BC8-F283-45AE-878A-BAB7291924A1}"/>
                 <w:text/>
               </w:sdtPr>
-              <w:sdtEndPr/>
               <w:sdtContent>
                 <w:tc>
                   <w:tcPr>
@@ -129,17 +114,13 @@
                   </w:tcPr>
                   <w:p>
                     <w:pPr>
-                      <w:pStyle w:val="Sansinterligne"/>
+                      <w:pStyle w:val="NoSpacing"/>
                       <w:rPr>
-                        <w:sz w:val="28"/>
-                        <w:szCs w:val="28"/>
                         <w:lang w:val="en-US"/>
                       </w:rPr>
                     </w:pPr>
                     <w:r>
                       <w:rPr>
-                        <w:sz w:val="28"/>
-                        <w:szCs w:val="28"/>
                         <w:lang w:val="en-US"/>
                       </w:rPr>
                       <w:t>Group 14 – Apartments Domotic</w:t>
@@ -173,9 +154,7 @@
               <w:sdt>
                 <w:sdtPr>
                   <w:rPr>
-                    <w:sz w:val="28"/>
-                    <w:szCs w:val="28"/>
-                    <w:lang w:val="en-US"/>
+                    <w:lang w:val="de-DE"/>
                   </w:rPr>
                   <w:alias w:val="Auteur"/>
                   <w:id w:val="13406928"/>
@@ -185,22 +164,17 @@
                   <w:dataBinding w:prefixMappings="xmlns:ns0='http://schemas.openxmlformats.org/package/2006/metadata/core-properties' xmlns:ns1='http://purl.org/dc/elements/1.1/'" w:xpath="/ns0:coreProperties[1]/ns1:creator[1]" w:storeItemID="{6C3C8BC8-F283-45AE-878A-BAB7291924A1}"/>
                   <w:text/>
                 </w:sdtPr>
-                <w:sdtEndPr/>
                 <w:sdtContent>
                   <w:p>
                     <w:pPr>
-                      <w:pStyle w:val="Sansinterligne"/>
+                      <w:pStyle w:val="NoSpacing"/>
                       <w:rPr>
-                        <w:sz w:val="28"/>
-                        <w:szCs w:val="28"/>
-                        <w:lang w:val="en-US"/>
+                        <w:lang w:val="de-DE"/>
                       </w:rPr>
                     </w:pPr>
                     <w:r>
                       <w:rPr>
-                        <w:sz w:val="28"/>
-                        <w:szCs w:val="28"/>
-                        <w:lang w:val="en-US"/>
+                        <w:lang w:val="de-DE"/>
                       </w:rPr>
                       <w:t>Germanier Sacha, Von Roten Johann, Herbelin Dehlya</w:t>
                     </w:r>
@@ -210,8 +184,6 @@
               <w:sdt>
                 <w:sdtPr>
                   <w:rPr>
-                    <w:sz w:val="28"/>
-                    <w:szCs w:val="28"/>
                     <w:lang w:val="en-US"/>
                   </w:rPr>
                   <w:alias w:val="Date"/>
@@ -229,21 +201,16 @@
                     <w:calendar w:val="gregorian"/>
                   </w:date>
                 </w:sdtPr>
-                <w:sdtEndPr/>
                 <w:sdtContent>
                   <w:p>
                     <w:pPr>
-                      <w:pStyle w:val="Sansinterligne"/>
+                      <w:pStyle w:val="NoSpacing"/>
                       <w:rPr>
-                        <w:sz w:val="28"/>
-                        <w:szCs w:val="28"/>
                         <w:lang w:val="en-US"/>
                       </w:rPr>
                     </w:pPr>
                     <w:r>
                       <w:rPr>
-                        <w:sz w:val="28"/>
-                        <w:szCs w:val="28"/>
                         <w:lang w:val="en-US"/>
                       </w:rPr>
                       <w:t>[Date]</w:t>
@@ -253,9 +220,8 @@
               </w:sdt>
               <w:p>
                 <w:pPr>
-                  <w:pStyle w:val="Sansinterligne"/>
+                  <w:pStyle w:val="NoSpacing"/>
                   <w:rPr>
-                    <w:color w:val="156082" w:themeColor="accent1"/>
                     <w:lang w:val="en-US"/>
                   </w:rPr>
                 </w:pPr>
@@ -272,16 +238,6 @@
     </w:sdt>
     <w:sdt>
       <w:sdtPr>
-        <w:rPr>
-          <w:rFonts w:asciiTheme="minorHAnsi" w:eastAsiaTheme="minorHAnsi" w:hAnsiTheme="minorHAnsi" w:cstheme="minorBidi"/>
-          <w:b w:val="0"/>
-          <w:color w:val="auto"/>
-          <w:kern w:val="2"/>
-          <w:sz w:val="22"/>
-          <w:szCs w:val="22"/>
-          <w:lang w:eastAsia="en-US"/>
-          <w14:ligatures w14:val="standardContextual"/>
-        </w:rPr>
         <w:id w:val="1873109719"/>
         <w:docPartObj>
           <w:docPartGallery w:val="Table of Contents"/>
@@ -290,33 +246,27 @@
       </w:sdtPr>
       <w:sdtEndPr>
         <w:rPr>
-          <w:bCs/>
-          <w:sz w:val="28"/>
+          <w:rFonts w:asciiTheme="minorHAnsi" w:eastAsiaTheme="minorEastAsia" w:hAnsiTheme="minorHAnsi" w:cstheme="minorBidi"/>
+          <w:color w:val="auto"/>
+          <w:sz w:val="26"/>
+          <w:szCs w:val="24"/>
         </w:rPr>
       </w:sdtEndPr>
       <w:sdtContent>
         <w:p>
           <w:pPr>
-            <w:pStyle w:val="En-ttedetabledesmatires"/>
+            <w:pStyle w:val="TOCHeading"/>
             <w:tabs>
               <w:tab w:val="left" w:pos="3036"/>
             </w:tabs>
-            <w:rPr>
-              <w:sz w:val="52"/>
-              <w:szCs w:val="52"/>
-            </w:rPr>
           </w:pPr>
           <w:r>
-            <w:rPr>
-              <w:sz w:val="52"/>
-              <w:szCs w:val="52"/>
-            </w:rPr>
             <w:t>Table of contents</w:t>
           </w:r>
         </w:p>
         <w:p>
           <w:pPr>
-            <w:pStyle w:val="En-ttedetabledesmatires"/>
+            <w:pStyle w:val="TOCHeading"/>
             <w:tabs>
               <w:tab w:val="left" w:pos="3036"/>
             </w:tabs>
@@ -327,16 +277,12 @@
         </w:p>
         <w:p>
           <w:pPr>
-            <w:pStyle w:val="TM1"/>
+            <w:pStyle w:val="TOC1"/>
             <w:tabs>
               <w:tab w:val="right" w:leader="dot" w:pos="10456"/>
             </w:tabs>
             <w:rPr>
-              <w:rFonts w:eastAsiaTheme="minorEastAsia"/>
-              <w:noProof/>
-              <w:sz w:val="24"/>
-              <w:szCs w:val="24"/>
-              <w:lang w:val="fr-CH" w:eastAsia="fr-CH"/>
+              <w:lang w:eastAsia="fr-CH"/>
             </w:rPr>
           </w:pPr>
           <w:r>
@@ -350,56 +296,45 @@
           </w:r>
           <w:hyperlink w:anchor="_Toc228282255" w:history="1">
             <w:r>
-              <w:rPr>
-                <w:rStyle w:val="Lienhypertexte"/>
-                <w:noProof/>
-              </w:rPr>
               <w:t>Introduction</w:t>
             </w:r>
             <w:r>
               <w:rPr>
-                <w:noProof/>
                 <w:webHidden/>
               </w:rPr>
               <w:tab/>
             </w:r>
             <w:r>
               <w:rPr>
-                <w:noProof/>
                 <w:webHidden/>
               </w:rPr>
               <w:fldChar w:fldCharType="begin"/>
             </w:r>
             <w:r>
               <w:rPr>
-                <w:noProof/>
                 <w:webHidden/>
               </w:rPr>
               <w:instrText xml:space="preserve"> PAGEREF _Toc228282255 \h </w:instrText>
             </w:r>
             <w:r>
               <w:rPr>
-                <w:noProof/>
-                <w:webHidden/>
-              </w:rPr>
-            </w:r>
-            <w:r>
-              <w:rPr>
-                <w:noProof/>
+                <w:webHidden/>
+              </w:rPr>
+            </w:r>
+            <w:r>
+              <w:rPr>
                 <w:webHidden/>
               </w:rPr>
               <w:fldChar w:fldCharType="separate"/>
             </w:r>
             <w:r>
               <w:rPr>
-                <w:noProof/>
                 <w:webHidden/>
               </w:rPr>
               <w:t>2</w:t>
             </w:r>
             <w:r>
               <w:rPr>
-                <w:noProof/>
                 <w:webHidden/>
               </w:rPr>
               <w:fldChar w:fldCharType="end"/>
@@ -408,70 +343,55 @@
         </w:p>
         <w:p>
           <w:pPr>
-            <w:pStyle w:val="TM1"/>
+            <w:pStyle w:val="TOC1"/>
             <w:tabs>
               <w:tab w:val="right" w:leader="dot" w:pos="10456"/>
             </w:tabs>
             <w:rPr>
-              <w:rFonts w:eastAsiaTheme="minorEastAsia"/>
-              <w:noProof/>
-              <w:sz w:val="24"/>
-              <w:szCs w:val="24"/>
-              <w:lang w:val="fr-CH" w:eastAsia="fr-CH"/>
+              <w:lang w:eastAsia="fr-CH"/>
             </w:rPr>
           </w:pPr>
           <w:hyperlink w:anchor="_Toc228282256" w:history="1">
             <w:r>
-              <w:rPr>
-                <w:rStyle w:val="Lienhypertexte"/>
-                <w:noProof/>
-              </w:rPr>
               <w:t>Navigation &amp; Filter</w:t>
             </w:r>
             <w:r>
               <w:rPr>
-                <w:noProof/>
                 <w:webHidden/>
               </w:rPr>
               <w:tab/>
             </w:r>
             <w:r>
               <w:rPr>
-                <w:noProof/>
                 <w:webHidden/>
               </w:rPr>
               <w:fldChar w:fldCharType="begin"/>
             </w:r>
             <w:r>
               <w:rPr>
-                <w:noProof/>
                 <w:webHidden/>
               </w:rPr>
               <w:instrText xml:space="preserve"> PAGEREF _Toc228282256 \h </w:instrText>
             </w:r>
             <w:r>
               <w:rPr>
-                <w:noProof/>
-                <w:webHidden/>
-              </w:rPr>
-            </w:r>
-            <w:r>
-              <w:rPr>
-                <w:noProof/>
+                <w:webHidden/>
+              </w:rPr>
+            </w:r>
+            <w:r>
+              <w:rPr>
                 <w:webHidden/>
               </w:rPr>
               <w:fldChar w:fldCharType="separate"/>
             </w:r>
             <w:r>
               <w:rPr>
-                <w:noProof/>
                 <w:webHidden/>
               </w:rPr>
               <w:t>2</w:t>
             </w:r>
             <w:r>
               <w:rPr>
-                <w:noProof/>
                 <w:webHidden/>
               </w:rPr>
               <w:fldChar w:fldCharType="end"/>
@@ -480,70 +400,55 @@
         </w:p>
         <w:p>
           <w:pPr>
-            <w:pStyle w:val="TM1"/>
+            <w:pStyle w:val="TOC1"/>
             <w:tabs>
               <w:tab w:val="right" w:leader="dot" w:pos="10456"/>
             </w:tabs>
             <w:rPr>
-              <w:rFonts w:eastAsiaTheme="minorEastAsia"/>
-              <w:noProof/>
-              <w:sz w:val="24"/>
-              <w:szCs w:val="24"/>
-              <w:lang w:val="fr-CH" w:eastAsia="fr-CH"/>
+              <w:lang w:eastAsia="fr-CH"/>
             </w:rPr>
           </w:pPr>
           <w:hyperlink w:anchor="_Toc228282257" w:history="1">
             <w:r>
-              <w:rPr>
-                <w:rStyle w:val="Lienhypertexte"/>
-                <w:noProof/>
-              </w:rPr>
               <w:t>Compare page</w:t>
             </w:r>
             <w:r>
               <w:rPr>
-                <w:noProof/>
                 <w:webHidden/>
               </w:rPr>
               <w:tab/>
             </w:r>
             <w:r>
               <w:rPr>
-                <w:noProof/>
                 <w:webHidden/>
               </w:rPr>
               <w:fldChar w:fldCharType="begin"/>
             </w:r>
             <w:r>
               <w:rPr>
-                <w:noProof/>
                 <w:webHidden/>
               </w:rPr>
               <w:instrText xml:space="preserve"> PAGEREF _Toc228282257 \h </w:instrText>
             </w:r>
             <w:r>
               <w:rPr>
-                <w:noProof/>
-                <w:webHidden/>
-              </w:rPr>
-            </w:r>
-            <w:r>
-              <w:rPr>
-                <w:noProof/>
+                <w:webHidden/>
+              </w:rPr>
+            </w:r>
+            <w:r>
+              <w:rPr>
                 <w:webHidden/>
               </w:rPr>
               <w:fldChar w:fldCharType="separate"/>
             </w:r>
             <w:r>
               <w:rPr>
-                <w:noProof/>
                 <w:webHidden/>
               </w:rPr>
               <w:t>3</w:t>
             </w:r>
             <w:r>
               <w:rPr>
-                <w:noProof/>
                 <w:webHidden/>
               </w:rPr>
               <w:fldChar w:fldCharType="end"/>
@@ -552,70 +457,55 @@
         </w:p>
         <w:p>
           <w:pPr>
-            <w:pStyle w:val="TM1"/>
+            <w:pStyle w:val="TOC1"/>
             <w:tabs>
               <w:tab w:val="right" w:leader="dot" w:pos="10456"/>
             </w:tabs>
             <w:rPr>
-              <w:rFonts w:eastAsiaTheme="minorEastAsia"/>
-              <w:noProof/>
-              <w:sz w:val="24"/>
-              <w:szCs w:val="24"/>
-              <w:lang w:val="fr-CH" w:eastAsia="fr-CH"/>
+              <w:lang w:eastAsia="fr-CH"/>
             </w:rPr>
           </w:pPr>
           <w:hyperlink w:anchor="_Toc228282258" w:history="1">
             <w:r>
-              <w:rPr>
-                <w:rStyle w:val="Lienhypertexte"/>
-                <w:noProof/>
-              </w:rPr>
               <w:t>Overview page</w:t>
             </w:r>
             <w:r>
               <w:rPr>
-                <w:noProof/>
                 <w:webHidden/>
               </w:rPr>
               <w:tab/>
             </w:r>
             <w:r>
               <w:rPr>
-                <w:noProof/>
                 <w:webHidden/>
               </w:rPr>
               <w:fldChar w:fldCharType="begin"/>
             </w:r>
             <w:r>
               <w:rPr>
-                <w:noProof/>
                 <w:webHidden/>
               </w:rPr>
               <w:instrText xml:space="preserve"> PAGEREF _Toc228282258 \h </w:instrText>
             </w:r>
             <w:r>
               <w:rPr>
-                <w:noProof/>
-                <w:webHidden/>
-              </w:rPr>
-            </w:r>
-            <w:r>
-              <w:rPr>
-                <w:noProof/>
+                <w:webHidden/>
+              </w:rPr>
+            </w:r>
+            <w:r>
+              <w:rPr>
                 <w:webHidden/>
               </w:rPr>
               <w:fldChar w:fldCharType="separate"/>
             </w:r>
             <w:r>
               <w:rPr>
-                <w:noProof/>
                 <w:webHidden/>
               </w:rPr>
               <w:t>4</w:t>
             </w:r>
             <w:r>
               <w:rPr>
-                <w:noProof/>
                 <w:webHidden/>
               </w:rPr>
               <w:fldChar w:fldCharType="end"/>
@@ -624,70 +514,55 @@
         </w:p>
         <w:p>
           <w:pPr>
-            <w:pStyle w:val="TM1"/>
+            <w:pStyle w:val="TOC1"/>
             <w:tabs>
               <w:tab w:val="right" w:leader="dot" w:pos="10456"/>
             </w:tabs>
             <w:rPr>
-              <w:rFonts w:eastAsiaTheme="minorEastAsia"/>
-              <w:noProof/>
-              <w:sz w:val="24"/>
-              <w:szCs w:val="24"/>
-              <w:lang w:val="fr-CH" w:eastAsia="fr-CH"/>
+              <w:lang w:eastAsia="fr-CH"/>
             </w:rPr>
           </w:pPr>
           <w:hyperlink w:anchor="_Toc228282259" w:history="1">
             <w:r>
-              <w:rPr>
-                <w:rStyle w:val="Lienhypertexte"/>
-                <w:noProof/>
-              </w:rPr>
               <w:t>Environment page</w:t>
             </w:r>
             <w:r>
               <w:rPr>
-                <w:noProof/>
                 <w:webHidden/>
               </w:rPr>
               <w:tab/>
             </w:r>
             <w:r>
               <w:rPr>
-                <w:noProof/>
                 <w:webHidden/>
               </w:rPr>
               <w:fldChar w:fldCharType="begin"/>
             </w:r>
             <w:r>
               <w:rPr>
-                <w:noProof/>
                 <w:webHidden/>
               </w:rPr>
               <w:instrText xml:space="preserve"> PAGEREF _Toc228282259 \h </w:instrText>
             </w:r>
             <w:r>
               <w:rPr>
-                <w:noProof/>
-                <w:webHidden/>
-              </w:rPr>
-            </w:r>
-            <w:r>
-              <w:rPr>
-                <w:noProof/>
+                <w:webHidden/>
+              </w:rPr>
+            </w:r>
+            <w:r>
+              <w:rPr>
                 <w:webHidden/>
               </w:rPr>
               <w:fldChar w:fldCharType="separate"/>
             </w:r>
             <w:r>
               <w:rPr>
-                <w:noProof/>
                 <w:webHidden/>
               </w:rPr>
               <w:t>5</w:t>
             </w:r>
             <w:r>
               <w:rPr>
-                <w:noProof/>
                 <w:webHidden/>
               </w:rPr>
               <w:fldChar w:fldCharType="end"/>
@@ -696,70 +571,55 @@
         </w:p>
         <w:p>
           <w:pPr>
-            <w:pStyle w:val="TM1"/>
+            <w:pStyle w:val="TOC1"/>
             <w:tabs>
               <w:tab w:val="right" w:leader="dot" w:pos="10456"/>
             </w:tabs>
             <w:rPr>
-              <w:rFonts w:eastAsiaTheme="minorEastAsia"/>
-              <w:noProof/>
-              <w:sz w:val="24"/>
-              <w:szCs w:val="24"/>
-              <w:lang w:val="fr-CH" w:eastAsia="fr-CH"/>
+              <w:lang w:eastAsia="fr-CH"/>
             </w:rPr>
           </w:pPr>
           <w:hyperlink w:anchor="_Toc228282260" w:history="1">
             <w:r>
-              <w:rPr>
-                <w:rStyle w:val="Lienhypertexte"/>
-                <w:noProof/>
-              </w:rPr>
               <w:t>Energy page</w:t>
             </w:r>
             <w:r>
               <w:rPr>
-                <w:noProof/>
                 <w:webHidden/>
               </w:rPr>
               <w:tab/>
             </w:r>
             <w:r>
               <w:rPr>
-                <w:noProof/>
                 <w:webHidden/>
               </w:rPr>
               <w:fldChar w:fldCharType="begin"/>
             </w:r>
             <w:r>
               <w:rPr>
-                <w:noProof/>
                 <w:webHidden/>
               </w:rPr>
               <w:instrText xml:space="preserve"> PAGEREF _Toc228282260 \h </w:instrText>
             </w:r>
             <w:r>
               <w:rPr>
-                <w:noProof/>
-                <w:webHidden/>
-              </w:rPr>
-            </w:r>
-            <w:r>
-              <w:rPr>
-                <w:noProof/>
+                <w:webHidden/>
+              </w:rPr>
+            </w:r>
+            <w:r>
+              <w:rPr>
                 <w:webHidden/>
               </w:rPr>
               <w:fldChar w:fldCharType="separate"/>
             </w:r>
             <w:r>
               <w:rPr>
-                <w:noProof/>
                 <w:webHidden/>
               </w:rPr>
               <w:t>6</w:t>
             </w:r>
             <w:r>
               <w:rPr>
-                <w:noProof/>
                 <w:webHidden/>
               </w:rPr>
               <w:fldChar w:fldCharType="end"/>
@@ -768,70 +628,55 @@
         </w:p>
         <w:p>
           <w:pPr>
-            <w:pStyle w:val="TM1"/>
+            <w:pStyle w:val="TOC1"/>
             <w:tabs>
               <w:tab w:val="right" w:leader="dot" w:pos="10456"/>
             </w:tabs>
             <w:rPr>
-              <w:rFonts w:eastAsiaTheme="minorEastAsia"/>
-              <w:noProof/>
-              <w:sz w:val="24"/>
-              <w:szCs w:val="24"/>
-              <w:lang w:val="fr-CH" w:eastAsia="fr-CH"/>
+              <w:lang w:eastAsia="fr-CH"/>
             </w:rPr>
           </w:pPr>
           <w:hyperlink w:anchor="_Toc228282261" w:history="1">
             <w:r>
-              <w:rPr>
-                <w:rStyle w:val="Lienhypertexte"/>
-                <w:noProof/>
-              </w:rPr>
               <w:t>Presence page</w:t>
             </w:r>
             <w:r>
               <w:rPr>
-                <w:noProof/>
                 <w:webHidden/>
               </w:rPr>
               <w:tab/>
             </w:r>
             <w:r>
               <w:rPr>
-                <w:noProof/>
                 <w:webHidden/>
               </w:rPr>
               <w:fldChar w:fldCharType="begin"/>
             </w:r>
             <w:r>
               <w:rPr>
-                <w:noProof/>
                 <w:webHidden/>
               </w:rPr>
               <w:instrText xml:space="preserve"> PAGEREF _Toc228282261 \h </w:instrText>
             </w:r>
             <w:r>
               <w:rPr>
-                <w:noProof/>
-                <w:webHidden/>
-              </w:rPr>
-            </w:r>
-            <w:r>
-              <w:rPr>
-                <w:noProof/>
+                <w:webHidden/>
+              </w:rPr>
+            </w:r>
+            <w:r>
+              <w:rPr>
                 <w:webHidden/>
               </w:rPr>
               <w:fldChar w:fldCharType="separate"/>
             </w:r>
             <w:r>
               <w:rPr>
-                <w:noProof/>
                 <w:webHidden/>
               </w:rPr>
               <w:t>7</w:t>
             </w:r>
             <w:r>
               <w:rPr>
-                <w:noProof/>
                 <w:webHidden/>
               </w:rPr>
               <w:fldChar w:fldCharType="end"/>
@@ -840,70 +685,55 @@
         </w:p>
         <w:p>
           <w:pPr>
-            <w:pStyle w:val="TM1"/>
+            <w:pStyle w:val="TOC1"/>
             <w:tabs>
               <w:tab w:val="right" w:leader="dot" w:pos="10456"/>
             </w:tabs>
             <w:rPr>
-              <w:rFonts w:eastAsiaTheme="minorEastAsia"/>
-              <w:noProof/>
-              <w:sz w:val="24"/>
-              <w:szCs w:val="24"/>
-              <w:lang w:val="fr-CH" w:eastAsia="fr-CH"/>
+              <w:lang w:eastAsia="fr-CH"/>
             </w:rPr>
           </w:pPr>
           <w:hyperlink w:anchor="_Toc228282262" w:history="1">
             <w:r>
-              <w:rPr>
-                <w:rStyle w:val="Lienhypertexte"/>
-                <w:noProof/>
-              </w:rPr>
               <w:t>Device health page</w:t>
             </w:r>
             <w:r>
               <w:rPr>
-                <w:noProof/>
                 <w:webHidden/>
               </w:rPr>
               <w:tab/>
             </w:r>
             <w:r>
               <w:rPr>
-                <w:noProof/>
                 <w:webHidden/>
               </w:rPr>
               <w:fldChar w:fldCharType="begin"/>
             </w:r>
             <w:r>
               <w:rPr>
-                <w:noProof/>
                 <w:webHidden/>
               </w:rPr>
               <w:instrText xml:space="preserve"> PAGEREF _Toc228282262 \h </w:instrText>
             </w:r>
             <w:r>
               <w:rPr>
-                <w:noProof/>
-                <w:webHidden/>
-              </w:rPr>
-            </w:r>
-            <w:r>
-              <w:rPr>
-                <w:noProof/>
+                <w:webHidden/>
+              </w:rPr>
+            </w:r>
+            <w:r>
+              <w:rPr>
                 <w:webHidden/>
               </w:rPr>
               <w:fldChar w:fldCharType="separate"/>
             </w:r>
             <w:r>
               <w:rPr>
-                <w:noProof/>
                 <w:webHidden/>
               </w:rPr>
               <w:t>8</w:t>
             </w:r>
             <w:r>
               <w:rPr>
-                <w:noProof/>
                 <w:webHidden/>
               </w:rPr>
               <w:fldChar w:fldCharType="end"/>
@@ -912,70 +742,55 @@
         </w:p>
         <w:p>
           <w:pPr>
-            <w:pStyle w:val="TM1"/>
+            <w:pStyle w:val="TOC1"/>
             <w:tabs>
               <w:tab w:val="right" w:leader="dot" w:pos="10456"/>
             </w:tabs>
             <w:rPr>
-              <w:rFonts w:eastAsiaTheme="minorEastAsia"/>
-              <w:noProof/>
-              <w:sz w:val="24"/>
-              <w:szCs w:val="24"/>
-              <w:lang w:val="fr-CH" w:eastAsia="fr-CH"/>
+              <w:lang w:eastAsia="fr-CH"/>
             </w:rPr>
           </w:pPr>
           <w:hyperlink w:anchor="_Toc228282263" w:history="1">
             <w:r>
-              <w:rPr>
-                <w:rStyle w:val="Lienhypertexte"/>
-                <w:noProof/>
-              </w:rPr>
               <w:t>Conclusion</w:t>
             </w:r>
             <w:r>
               <w:rPr>
-                <w:noProof/>
                 <w:webHidden/>
               </w:rPr>
               <w:tab/>
             </w:r>
             <w:r>
               <w:rPr>
-                <w:noProof/>
                 <w:webHidden/>
               </w:rPr>
               <w:fldChar w:fldCharType="begin"/>
             </w:r>
             <w:r>
               <w:rPr>
-                <w:noProof/>
                 <w:webHidden/>
               </w:rPr>
               <w:instrText xml:space="preserve"> PAGEREF _Toc228282263 \h </w:instrText>
             </w:r>
             <w:r>
               <w:rPr>
-                <w:noProof/>
-                <w:webHidden/>
-              </w:rPr>
-            </w:r>
-            <w:r>
-              <w:rPr>
-                <w:noProof/>
+                <w:webHidden/>
+              </w:rPr>
+            </w:r>
+            <w:r>
+              <w:rPr>
                 <w:webHidden/>
               </w:rPr>
               <w:fldChar w:fldCharType="separate"/>
             </w:r>
             <w:r>
               <w:rPr>
-                <w:noProof/>
                 <w:webHidden/>
               </w:rPr>
               <w:t>9</w:t>
             </w:r>
             <w:r>
               <w:rPr>
-                <w:noProof/>
                 <w:webHidden/>
               </w:rPr>
               <w:fldChar w:fldCharType="end"/>
@@ -984,70 +799,55 @@
         </w:p>
         <w:p>
           <w:pPr>
-            <w:pStyle w:val="TM1"/>
+            <w:pStyle w:val="TOC1"/>
             <w:tabs>
               <w:tab w:val="right" w:leader="dot" w:pos="10456"/>
             </w:tabs>
             <w:rPr>
-              <w:rFonts w:eastAsiaTheme="minorEastAsia"/>
-              <w:noProof/>
-              <w:sz w:val="24"/>
-              <w:szCs w:val="24"/>
-              <w:lang w:val="fr-CH" w:eastAsia="fr-CH"/>
+              <w:lang w:eastAsia="fr-CH"/>
             </w:rPr>
           </w:pPr>
           <w:hyperlink w:anchor="_Toc228282264" w:history="1">
             <w:r>
-              <w:rPr>
-                <w:rStyle w:val="Lienhypertexte"/>
-                <w:noProof/>
-              </w:rPr>
               <w:t>FAQ</w:t>
             </w:r>
             <w:r>
               <w:rPr>
-                <w:noProof/>
                 <w:webHidden/>
               </w:rPr>
               <w:tab/>
             </w:r>
             <w:r>
               <w:rPr>
-                <w:noProof/>
                 <w:webHidden/>
               </w:rPr>
               <w:fldChar w:fldCharType="begin"/>
             </w:r>
             <w:r>
               <w:rPr>
-                <w:noProof/>
                 <w:webHidden/>
               </w:rPr>
               <w:instrText xml:space="preserve"> PAGEREF _Toc228282264 \h </w:instrText>
             </w:r>
             <w:r>
               <w:rPr>
-                <w:noProof/>
-                <w:webHidden/>
-              </w:rPr>
-            </w:r>
-            <w:r>
-              <w:rPr>
-                <w:noProof/>
+                <w:webHidden/>
+              </w:rPr>
+            </w:r>
+            <w:r>
+              <w:rPr>
                 <w:webHidden/>
               </w:rPr>
               <w:fldChar w:fldCharType="separate"/>
             </w:r>
             <w:r>
               <w:rPr>
-                <w:noProof/>
                 <w:webHidden/>
               </w:rPr>
               <w:t>9</w:t>
             </w:r>
             <w:r>
               <w:rPr>
-                <w:noProof/>
                 <w:webHidden/>
               </w:rPr>
               <w:fldChar w:fldCharType="end"/>
@@ -1056,10 +856,6 @@
         </w:p>
         <w:p>
           <w:r>
-            <w:rPr>
-              <w:b/>
-              <w:bCs/>
-            </w:rPr>
             <w:fldChar w:fldCharType="end"/>
           </w:r>
         </w:p>
@@ -1072,7 +868,7 @@
     </w:p>
     <w:p>
       <w:pPr>
-        <w:pStyle w:val="Titre1"/>
+        <w:pStyle w:val="Heading1"/>
       </w:pPr>
       <w:bookmarkStart w:id="0" w:name="_Toc228282255"/>
       <w:r>
@@ -1103,7 +899,7 @@
     </w:p>
     <w:p>
       <w:pPr>
-        <w:pStyle w:val="Paragraphedeliste"/>
+        <w:pStyle w:val="ListParagraph"/>
         <w:numPr>
           <w:ilvl w:val="0"/>
           <w:numId w:val="2"/>
@@ -1121,7 +917,7 @@
     </w:p>
     <w:p>
       <w:pPr>
-        <w:pStyle w:val="Paragraphedeliste"/>
+        <w:pStyle w:val="ListParagraph"/>
         <w:numPr>
           <w:ilvl w:val="0"/>
           <w:numId w:val="2"/>
@@ -1146,7 +942,7 @@
     <w:p/>
     <w:p>
       <w:pPr>
-        <w:pStyle w:val="Titre1"/>
+        <w:pStyle w:val="Heading1"/>
       </w:pPr>
       <w:bookmarkStart w:id="1" w:name="_Toc228282256"/>
       <w:r>
@@ -1155,151 +951,95 @@
       <w:bookmarkEnd w:id="1"/>
     </w:p>
     <w:p>
-      <w:pPr>
-        <w:rPr>
-          <w:b/>
-          <w:bCs/>
-          <w:szCs w:val="28"/>
-        </w:rPr>
-      </w:pPr>
-      <w:r>
-        <w:rPr>
-          <w:szCs w:val="28"/>
-        </w:rPr>
+      <w:r>
         <w:t xml:space="preserve">At the top of each page, you can </w:t>
       </w:r>
       <w:r>
-        <w:rPr>
-          <w:szCs w:val="28"/>
-        </w:rPr>
         <w:t>click on the menu</w:t>
       </w:r>
       <w:r>
-        <w:rPr>
-          <w:szCs w:val="28"/>
-        </w:rPr>
         <w:t>. This will switch between different thematic pages of the report:</w:t>
       </w:r>
     </w:p>
     <w:p>
       <w:pPr>
-        <w:pStyle w:val="Paragraphedeliste"/>
+        <w:pStyle w:val="ListParagraph"/>
+        <w:numPr>
+          <w:ilvl w:val="0"/>
+          <w:numId w:val="3"/>
+        </w:numPr>
+      </w:pPr>
+      <w:r>
+        <w:t>Overview: A high-level summary of all key metrics.</w:t>
+      </w:r>
+    </w:p>
+    <w:p>
+      <w:pPr>
+        <w:pStyle w:val="ListParagraph"/>
         <w:numPr>
           <w:ilvl w:val="0"/>
           <w:numId w:val="3"/>
         </w:numPr>
         <w:rPr>
-          <w:szCs w:val="28"/>
+          <w:lang w:val="en-GB"/>
         </w:rPr>
       </w:pPr>
       <w:r>
         <w:rPr>
-          <w:b/>
-          <w:bCs/>
-          <w:szCs w:val="28"/>
+          <w:lang w:val="en-GB"/>
         </w:rPr>
-        <w:t>Overview:</w:t>
+        <w:t xml:space="preserve">Environment: Details </w:t>
       </w:r>
       <w:r>
         <w:rPr>
-          <w:szCs w:val="28"/>
+          <w:sz w:val="24"/>
+          <w:lang w:val="en-GB"/>
         </w:rPr>
-        <w:t xml:space="preserve"> A high-level summary of all key metrics.</w:t>
-      </w:r>
-    </w:p>
-    <w:p>
-      <w:pPr>
-        <w:pStyle w:val="Paragraphedeliste"/>
+        <w:t xml:space="preserve">regarding </w:t>
+      </w:r>
+      <w:r>
+        <w:rPr>
+          <w:lang w:val="en-GB"/>
+        </w:rPr>
+        <w:t>temperature, humidity, or air quality.</w:t>
+      </w:r>
+    </w:p>
+    <w:p>
+      <w:pPr>
+        <w:pStyle w:val="ListParagraph"/>
         <w:numPr>
           <w:ilvl w:val="0"/>
           <w:numId w:val="3"/>
         </w:numPr>
-        <w:rPr>
-          <w:szCs w:val="28"/>
-        </w:rPr>
-      </w:pPr>
-      <w:r>
-        <w:rPr>
-          <w:b/>
-          <w:bCs/>
-          <w:szCs w:val="28"/>
-        </w:rPr>
-        <w:t>Environment:</w:t>
-      </w:r>
-      <w:r>
-        <w:rPr>
-          <w:szCs w:val="28"/>
-        </w:rPr>
-        <w:t xml:space="preserve"> Details regarding temperature, humidity, or air quality.</w:t>
-      </w:r>
-    </w:p>
-    <w:p>
-      <w:pPr>
-        <w:pStyle w:val="Paragraphedeliste"/>
+      </w:pPr>
+      <w:r>
+        <w:t>Energy:</w:t>
+      </w:r>
+      <w:r>
+        <w:t xml:space="preserve"> Insights into power consumption and efficiency.</w:t>
+      </w:r>
+    </w:p>
+    <w:p>
+      <w:pPr>
+        <w:pStyle w:val="ListParagraph"/>
         <w:numPr>
           <w:ilvl w:val="0"/>
           <w:numId w:val="3"/>
         </w:numPr>
-        <w:rPr>
-          <w:szCs w:val="28"/>
-        </w:rPr>
-      </w:pPr>
-      <w:r>
-        <w:rPr>
-          <w:b/>
-          <w:bCs/>
-          <w:szCs w:val="28"/>
-        </w:rPr>
-        <w:t>Energy:</w:t>
-      </w:r>
-      <w:r>
-        <w:rPr>
-          <w:szCs w:val="28"/>
-        </w:rPr>
-        <w:t xml:space="preserve"> Insights into power consumption and efficiency.</w:t>
-      </w:r>
-    </w:p>
-    <w:p>
-      <w:pPr>
-        <w:pStyle w:val="Paragraphedeliste"/>
+      </w:pPr>
+      <w:r>
+        <w:t>Presence: Tracking occupancy and movement patterns.</w:t>
+      </w:r>
+    </w:p>
+    <w:p>
+      <w:pPr>
+        <w:pStyle w:val="ListParagraph"/>
         <w:numPr>
           <w:ilvl w:val="0"/>
           <w:numId w:val="3"/>
         </w:numPr>
-        <w:rPr>
-          <w:szCs w:val="28"/>
-        </w:rPr>
-      </w:pPr>
-      <w:r>
-        <w:rPr>
-          <w:b/>
-          <w:bCs/>
-          <w:szCs w:val="28"/>
-        </w:rPr>
-        <w:t>Presence:</w:t>
-      </w:r>
-      <w:r>
-        <w:rPr>
-          <w:szCs w:val="28"/>
-        </w:rPr>
-        <w:t xml:space="preserve"> Tracking occupancy and movement patterns.</w:t>
-      </w:r>
-    </w:p>
-    <w:p>
-      <w:pPr>
-        <w:pStyle w:val="Paragraphedeliste"/>
-        <w:numPr>
-          <w:ilvl w:val="0"/>
-          <w:numId w:val="3"/>
-        </w:numPr>
-        <w:rPr>
-          <w:szCs w:val="28"/>
-        </w:rPr>
-      </w:pPr>
-      <w:r>
-        <w:rPr>
-          <w:noProof/>
-        </w:rPr>
+      </w:pPr>
+      <w:r>
         <mc:AlternateContent>
           <mc:Choice Requires="wps">
             <w:drawing>
@@ -1363,14 +1103,12 @@
                               <w:rPr>
                                 <w:sz w:val="22"/>
                                 <w:szCs w:val="18"/>
-                                <w:lang w:val="fr-CH"/>
                               </w:rPr>
                             </w:pPr>
                             <w:r>
                               <w:rPr>
                                 <w:sz w:val="22"/>
                                 <w:szCs w:val="18"/>
-                                <w:lang w:val="fr-CH"/>
                               </w:rPr>
                               <w:t>Go to a</w:t>
                             </w:r>
@@ -1378,7 +1116,6 @@
                               <w:rPr>
                                 <w:sz w:val="22"/>
                                 <w:szCs w:val="18"/>
-                                <w:lang w:val="fr-CH"/>
                               </w:rPr>
                               <w:t>n</w:t>
                             </w:r>
@@ -1386,7 +1123,6 @@
                               <w:rPr>
                                 <w:sz w:val="22"/>
                                 <w:szCs w:val="18"/>
-                                <w:lang w:val="fr-CH"/>
                               </w:rPr>
                               <w:t>other page menu</w:t>
                             </w:r>
@@ -1440,14 +1176,12 @@
                         <w:rPr>
                           <w:sz w:val="22"/>
                           <w:szCs w:val="18"/>
-                          <w:lang w:val="fr-CH"/>
                         </w:rPr>
                       </w:pPr>
                       <w:r>
                         <w:rPr>
                           <w:sz w:val="22"/>
                           <w:szCs w:val="18"/>
-                          <w:lang w:val="fr-CH"/>
                         </w:rPr>
                         <w:t>Go to a</w:t>
                       </w:r>
@@ -1455,7 +1189,6 @@
                         <w:rPr>
                           <w:sz w:val="22"/>
                           <w:szCs w:val="18"/>
-                          <w:lang w:val="fr-CH"/>
                         </w:rPr>
                         <w:t>n</w:t>
                       </w:r>
@@ -1463,7 +1196,6 @@
                         <w:rPr>
                           <w:sz w:val="22"/>
                           <w:szCs w:val="18"/>
-                          <w:lang w:val="fr-CH"/>
                         </w:rPr>
                         <w:t>other page menu</w:t>
                       </w:r>
@@ -1477,68 +1209,41 @@
         </mc:AlternateContent>
       </w:r>
       <w:r>
-        <w:rPr>
-          <w:b/>
-          <w:bCs/>
-          <w:szCs w:val="28"/>
-        </w:rPr>
-        <w:t>Device Health:</w:t>
-      </w:r>
-      <w:r>
-        <w:rPr>
-          <w:szCs w:val="28"/>
-        </w:rPr>
-        <w:t xml:space="preserve"> Monitoring the status and connectivity of your hardware.</w:t>
-      </w:r>
-    </w:p>
-    <w:p>
-      <w:pPr>
-        <w:pStyle w:val="Paragraphedeliste"/>
+        <w:t>Device Health: Monitoring the status and connectivity of your hardware.</w:t>
+      </w:r>
+    </w:p>
+    <w:p>
+      <w:pPr>
+        <w:pStyle w:val="ListParagraph"/>
         <w:numPr>
           <w:ilvl w:val="0"/>
           <w:numId w:val="3"/>
         </w:numPr>
         <w:rPr>
-          <w:szCs w:val="28"/>
+          <w:lang w:val="en-GB"/>
         </w:rPr>
       </w:pPr>
       <w:r>
         <w:rPr>
-          <w:i/>
-          <w:color w:val="2E5BFF"/>
+          <w:lang w:val="en-GB"/>
         </w:rPr>
         <w:t>Tip — press F11 in Power BI Desktop for a fullscreen presentation view that hides every toolbar.</w:t>
       </w:r>
     </w:p>
     <w:p>
       <w:pPr>
-        <w:pStyle w:val="Paragraphedeliste"/>
+        <w:pStyle w:val="ListParagraph"/>
         <w:numPr>
           <w:ilvl w:val="0"/>
           <w:numId w:val="3"/>
         </w:numPr>
-        <w:rPr>
-          <w:szCs w:val="28"/>
-        </w:rPr>
-      </w:pPr>
-      <w:r>
-        <w:rPr>
-          <w:i/>
-          <w:color w:val="2E5BFF"/>
-        </w:rPr>
+      </w:pPr>
+      <w:r>
         <w:t>Apartment-level access — each tenant only sees their own apartment thanks to Row-Level Security. To preview a tenant view (admin only): Modeling → View as → Other user → Jimmy or Jeremie.</w:t>
       </w:r>
     </w:p>
     <w:p>
-      <w:pPr>
-        <w:rPr>
-          <w:szCs w:val="28"/>
-        </w:rPr>
-      </w:pPr>
-      <w:r>
-        <w:rPr>
-          <w:noProof/>
-        </w:rPr>
+      <w:r>
         <mc:AlternateContent>
           <mc:Choice Requires="wps">
             <w:drawing>
@@ -1601,27 +1306,27 @@
                               <w:jc w:val="center"/>
                               <w:rPr>
                                 <w:sz w:val="22"/>
-                                <w:lang w:val="fr-CH"/>
+                                <w:lang w:val="en-GB"/>
                               </w:rPr>
                             </w:pPr>
                             <w:r>
                               <w:rPr>
                                 <w:sz w:val="22"/>
-                                <w:lang w:val="fr-CH"/>
+                                <w:lang w:val="en-GB"/>
                               </w:rPr>
                               <w:t xml:space="preserve">Filter to show only </w:t>
                             </w:r>
                             <w:r>
                               <w:rPr>
                                 <w:sz w:val="22"/>
-                                <w:lang w:val="fr-CH"/>
+                                <w:lang w:val="en-GB"/>
                               </w:rPr>
                               <w:t xml:space="preserve">the </w:t>
                             </w:r>
                             <w:r>
                               <w:rPr>
                                 <w:sz w:val="22"/>
-                                <w:lang w:val="fr-CH"/>
+                                <w:lang w:val="en-GB"/>
                               </w:rPr>
                               <w:t>data for this date</w:t>
                             </w:r>
@@ -1672,61 +1377,29 @@
                         <w:jc w:val="center"/>
                         <w:rPr>
                           <w:sz w:val="22"/>
-                          <w:lang w:val="fr-CH"/>
+                          <w:lang w:val="en-GB"/>
                         </w:rPr>
                       </w:pPr>
                       <w:r>
                         <w:rPr>
                           <w:sz w:val="22"/>
-                          <w:lang w:val="fr-CH"/>
+                          <w:lang w:val="en-GB"/>
                         </w:rPr>
-                        <w:t xml:space="preserve">Filter to show </w:t>
-                      </w:r>
-                      <w:proofErr w:type="spellStart"/>
-                      <w:r>
-                        <w:rPr>
-                          <w:sz w:val="22"/>
-                          <w:lang w:val="fr-CH"/>
-                        </w:rPr>
-                        <w:t>only</w:t>
-                      </w:r>
-                      <w:proofErr w:type="spellEnd"/>
-                      <w:r>
-                        <w:rPr>
-                          <w:sz w:val="22"/>
-                          <w:lang w:val="fr-CH"/>
-                        </w:rPr>
-                        <w:t xml:space="preserve"> </w:t>
+                        <w:t xml:space="preserve">Filter to show only </w:t>
                       </w:r>
                       <w:r>
                         <w:rPr>
                           <w:sz w:val="22"/>
-                          <w:lang w:val="fr-CH"/>
+                          <w:lang w:val="en-GB"/>
                         </w:rPr>
                         <w:t xml:space="preserve">the </w:t>
                       </w:r>
                       <w:r>
                         <w:rPr>
                           <w:sz w:val="22"/>
-                          <w:lang w:val="fr-CH"/>
+                          <w:lang w:val="en-GB"/>
                         </w:rPr>
-                        <w:t xml:space="preserve">data for </w:t>
-                      </w:r>
-                      <w:proofErr w:type="spellStart"/>
-                      <w:r>
-                        <w:rPr>
-                          <w:sz w:val="22"/>
-                          <w:lang w:val="fr-CH"/>
-                        </w:rPr>
-                        <w:t>this</w:t>
-                      </w:r>
-                      <w:proofErr w:type="spellEnd"/>
-                      <w:r>
-                        <w:rPr>
-                          <w:sz w:val="22"/>
-                          <w:lang w:val="fr-CH"/>
-                        </w:rPr>
-                        <w:t xml:space="preserve"> date</w:t>
+                        <w:t>data for this date</w:t>
                       </w:r>
                     </w:p>
                   </w:txbxContent>
@@ -1737,9 +1410,6 @@
         </mc:AlternateContent>
       </w:r>
       <w:r>
-        <w:rPr>
-          <w:noProof/>
-        </w:rPr>
         <mc:AlternateContent>
           <mc:Choice Requires="wps">
             <w:drawing>
@@ -1802,27 +1472,23 @@
                               <w:jc w:val="center"/>
                               <w:rPr>
                                 <w:sz w:val="22"/>
-                                <w:lang w:val="fr-CH"/>
+                                <w:lang w:val="en-GB"/>
                               </w:rPr>
                             </w:pPr>
                             <w:r>
                               <w:rPr>
                                 <w:sz w:val="22"/>
-                                <w:lang w:val="fr-CH"/>
+                                <w:lang w:val="en-GB"/>
                               </w:rPr>
-                              <w:t xml:space="preserve">Filter to show only data for </w:t>
-                            </w:r>
-                            <w:r>
-                              <w:rPr>
-                                <w:sz w:val="22"/>
-                                <w:lang w:val="fr-CH"/>
-                              </w:rPr>
-                              <w:t>one or many rooms</w:t>
+                              <w:t>Filter to show only data for one or many rooms</w:t>
                             </w:r>
                           </w:p>
                           <w:p>
                             <w:pPr>
                               <w:jc w:val="center"/>
+                              <w:rPr>
+                                <w:lang w:val="en-GB"/>
+                              </w:rPr>
                             </w:pPr>
                           </w:p>
                         </w:txbxContent>
@@ -1852,68 +1518,23 @@
                         <w:jc w:val="center"/>
                         <w:rPr>
                           <w:sz w:val="22"/>
-                          <w:lang w:val="fr-CH"/>
+                          <w:lang w:val="en-GB"/>
                         </w:rPr>
                       </w:pPr>
                       <w:r>
                         <w:rPr>
                           <w:sz w:val="22"/>
-                          <w:lang w:val="fr-CH"/>
+                          <w:lang w:val="en-GB"/>
                         </w:rPr>
-                        <w:t xml:space="preserve">Filter to show </w:t>
+                        <w:t>Filter to show only data for one or many rooms</w:t>
                       </w:r>
-                      <w:proofErr w:type="spellStart"/>
-                      <w:r>
-                        <w:rPr>
-                          <w:sz w:val="22"/>
-                          <w:lang w:val="fr-CH"/>
-                        </w:rPr>
-                        <w:t>only</w:t>
-                      </w:r>
-                      <w:proofErr w:type="spellEnd"/>
-                      <w:r>
-                        <w:rPr>
-                          <w:sz w:val="22"/>
-                          <w:lang w:val="fr-CH"/>
-                        </w:rPr>
-                        <w:t xml:space="preserve"> data for </w:t>
-                      </w:r>
-                      <w:r>
-                        <w:rPr>
-                          <w:sz w:val="22"/>
-                          <w:lang w:val="fr-CH"/>
-                        </w:rPr>
-                        <w:t xml:space="preserve">one or </w:t>
-                      </w:r>
-                      <w:proofErr w:type="spellStart"/>
-                      <w:r>
-                        <w:rPr>
-                          <w:sz w:val="22"/>
-                          <w:lang w:val="fr-CH"/>
-                        </w:rPr>
-                        <w:t>many</w:t>
-                      </w:r>
-                      <w:proofErr w:type="spellEnd"/>
-                      <w:r>
-                        <w:rPr>
-                          <w:sz w:val="22"/>
-                          <w:lang w:val="fr-CH"/>
-                        </w:rPr>
-                        <w:t xml:space="preserve"> </w:t>
-                      </w:r>
-                      <w:proofErr w:type="spellStart"/>
-                      <w:r>
-                        <w:rPr>
-                          <w:sz w:val="22"/>
-                          <w:lang w:val="fr-CH"/>
-                        </w:rPr>
-                        <w:t>rooms</w:t>
-                      </w:r>
-                      <w:proofErr w:type="spellEnd"/>
                     </w:p>
                     <w:p>
                       <w:pPr>
                         <w:jc w:val="center"/>
+                        <w:rPr>
+                          <w:lang w:val="en-GB"/>
+                        </w:rPr>
                       </w:pPr>
                     </w:p>
                   </w:txbxContent>
@@ -1924,9 +1545,6 @@
         </mc:AlternateContent>
       </w:r>
       <w:r>
-        <w:rPr>
-          <w:noProof/>
-        </w:rPr>
         <w:drawing>
           <wp:inline distT="0" distB="0" distL="0" distR="0" wp14:anchorId="29C2ED75" wp14:editId="18AD880B">
             <wp:extent cx="6645910" cy="1007110"/>
@@ -1965,54 +1583,30 @@
       </w:r>
     </w:p>
     <w:p/>
-    <w:p>
-      <w:pPr>
-        <w:rPr>
-          <w:szCs w:val="28"/>
-        </w:rPr>
-      </w:pPr>
-    </w:p>
     <w:p/>
-    <w:p>
-      <w:pPr>
-        <w:pStyle w:val="Titre1"/>
+    <w:p/>
+    <w:p>
+      <w:pPr>
+        <w:pStyle w:val="Heading1"/>
       </w:pPr>
       <w:bookmarkStart w:id="2" w:name="_Toc228282257"/>
       <w:r>
-        <w:lastRenderedPageBreak/>
         <w:t>Compare page</w:t>
       </w:r>
       <w:bookmarkEnd w:id="2"/>
     </w:p>
     <w:p/>
     <w:p>
-      <w:pPr>
-        <w:rPr>
-          <w:szCs w:val="28"/>
-        </w:rPr>
-      </w:pPr>
-      <w:r>
-        <w:rPr>
-          <w:szCs w:val="28"/>
-        </w:rPr>
+      <w:r>
         <w:t xml:space="preserve">In this page, you can see the two </w:t>
       </w:r>
       <w:r>
-        <w:rPr>
-          <w:szCs w:val="28"/>
-        </w:rPr>
         <w:t>apartments’</w:t>
       </w:r>
       <w:r>
-        <w:rPr>
-          <w:szCs w:val="28"/>
-        </w:rPr>
         <w:t xml:space="preserve"> metrics to </w:t>
       </w:r>
       <w:r>
-        <w:rPr>
-          <w:szCs w:val="28"/>
-        </w:rPr>
         <w:t>compare their data.</w:t>
       </w:r>
     </w:p>
@@ -2021,35 +1615,11 @@
         <w:jc w:val="both"/>
       </w:pPr>
       <w:r>
-        <w:rPr>
-          <w:noProof/>
-        </w:rPr>
         <w:t>On the metric column you can see what is measured. On the source column you can see the origin of the metric. The next column is the apartment. The actual values are recorded for each specific apartment. You can show one or both apartments by selecting the apartment slicer (Jimmy / Jeremie / both) and the date range. The last column displays only if you select both apartments and show the difference between the two.</w:t>
       </w:r>
-      <w:r>
-        <w:rPr>
-          <w:noProof/>
-        </w:rPr>
-      </w:r>
-      <w:r/>
-      <w:r/>
-      <w:r/>
-      <w:r/>
-      <w:r/>
-      <w:r/>
-      <w:r/>
-      <w:r/>
-      <w:r/>
-      <w:r/>
-      <w:r/>
-      <w:r/>
-      <w:r/>
-    </w:p>
-    <w:p>
-      <w:r>
-        <w:rPr>
-          <w:noProof/>
-        </w:rPr>
+    </w:p>
+    <w:p>
+      <w:r>
         <w:drawing>
           <wp:inline distT="0" distB="0" distL="0" distR="0" wp14:anchorId="43FB14B2" wp14:editId="3277A52D">
             <wp:extent cx="6645910" cy="3303905"/>
@@ -2096,7 +1666,7 @@
     <w:p/>
     <w:p>
       <w:pPr>
-        <w:pStyle w:val="Titre1"/>
+        <w:pStyle w:val="Heading1"/>
       </w:pPr>
       <w:bookmarkStart w:id="3" w:name="_Toc228282258"/>
       <w:r>
@@ -2106,15 +1676,7 @@
       <w:bookmarkEnd w:id="3"/>
     </w:p>
     <w:p>
-      <w:pPr>
-        <w:rPr>
-          <w:szCs w:val="28"/>
-        </w:rPr>
-      </w:pPr>
-      <w:r>
-        <w:rPr>
-          <w:noProof/>
-        </w:rPr>
+      <w:r>
         <w:drawing>
           <wp:anchor distT="0" distB="0" distL="114300" distR="114300" simplePos="0" relativeHeight="251662336" behindDoc="0" locked="0" layoutInCell="1" allowOverlap="1" wp14:anchorId="71235D50" wp14:editId="4288A310">
             <wp:simplePos x="0" y="0"/>
@@ -2195,72 +1757,30 @@
         </w:drawing>
       </w:r>
       <w:r>
-        <w:rPr>
-          <w:szCs w:val="28"/>
-        </w:rPr>
         <w:t xml:space="preserve">The overview page </w:t>
       </w:r>
       <w:r>
-        <w:rPr>
-          <w:szCs w:val="28"/>
-        </w:rPr>
         <w:t>shows</w:t>
       </w:r>
       <w:r>
-        <w:rPr>
-          <w:szCs w:val="28"/>
-        </w:rPr>
         <w:t xml:space="preserve"> a quick overview</w:t>
       </w:r>
       <w:r>
-        <w:rPr>
-          <w:szCs w:val="28"/>
-        </w:rPr>
         <w:t xml:space="preserve"> of different pages.</w:t>
       </w:r>
       <w:r>
-        <w:rPr>
-          <w:szCs w:val="28"/>
-        </w:rPr>
         <w:t xml:space="preserve"> </w:t>
       </w:r>
       <w:r>
-        <w:rPr>
-          <w:szCs w:val="28"/>
-        </w:rPr>
         <w:t xml:space="preserve">At the top you can see </w:t>
       </w:r>
       <w:r>
-        <w:rPr>
-          <w:szCs w:val="28"/>
-        </w:rPr>
-        <w:t xml:space="preserve">Key performance indicators. </w:t>
-      </w:r>
-      <w:r>
-        <w:rPr>
-          <w:szCs w:val="28"/>
-        </w:rPr>
-        <w:t>Each card uses color-coded metrics and trend indicator</w:t>
-      </w:r>
-      <w:r>
-        <w:rPr>
-          <w:szCs w:val="28"/>
-        </w:rPr>
-        <w:t xml:space="preserve">s </w:t>
-      </w:r>
-      <w:r>
-        <w:rPr>
-          <w:szCs w:val="28"/>
-        </w:rPr>
-        <w:t>to help you instantly determine if performance is optimal or requires intervention.</w:t>
+        <w:t>Key performance indicators. Each card uses color-coded metrics and trend indicators to help you instantly determine if performance is optimal or requires intervention.</w:t>
       </w:r>
     </w:p>
     <w:p/>
     <w:p>
       <w:r>
-        <w:rPr>
-          <w:noProof/>
-        </w:rPr>
         <w:drawing>
           <wp:anchor distT="0" distB="0" distL="114300" distR="114300" simplePos="0" relativeHeight="251697152" behindDoc="0" locked="0" layoutInCell="1" allowOverlap="1" wp14:anchorId="7E4681B2" wp14:editId="73E8F5FE">
             <wp:simplePos x="0" y="0"/>
@@ -2362,9 +1882,6 @@
     <w:p/>
     <w:p>
       <w:r>
-        <w:rPr>
-          <w:noProof/>
-        </w:rPr>
         <w:drawing>
           <wp:anchor distT="0" distB="0" distL="114300" distR="114300" simplePos="0" relativeHeight="251695104" behindDoc="0" locked="0" layoutInCell="1" allowOverlap="1" wp14:anchorId="2C550C6F" wp14:editId="7A0ABD39">
             <wp:simplePos x="0" y="0"/>
@@ -2447,11 +1964,10 @@
       <w:r>
         <w:t>Some graphs displayed in other pages are displayed here to quickly track energy, presence by just looking at the overview page. At the right most you can see information about the apartment.</w:t>
       </w:r>
-      <w:r/>
-    </w:p>
-    <w:p>
-      <w:pPr>
-        <w:pStyle w:val="Titre1"/>
+    </w:p>
+    <w:p>
+      <w:pPr>
+        <w:pStyle w:val="Heading1"/>
       </w:pPr>
       <w:bookmarkStart w:id="4" w:name="_Toc228282259"/>
       <w:r>
@@ -2462,9 +1978,6 @@
     </w:p>
     <w:p>
       <w:r>
-        <w:rPr>
-          <w:noProof/>
-        </w:rPr>
         <w:drawing>
           <wp:anchor distT="0" distB="0" distL="114300" distR="114300" simplePos="0" relativeHeight="251663360" behindDoc="0" locked="0" layoutInCell="1" allowOverlap="1" wp14:anchorId="61B1302E" wp14:editId="06C941AD">
             <wp:simplePos x="0" y="0"/>
@@ -2557,9 +2070,6 @@
     <w:p/>
     <w:p>
       <w:r>
-        <w:rPr>
-          <w:noProof/>
-        </w:rPr>
         <mc:AlternateContent>
           <mc:Choice Requires="wps">
             <w:drawing>
@@ -2623,14 +2133,14 @@
                               <w:rPr>
                                 <w:sz w:val="22"/>
                                 <w:szCs w:val="18"/>
-                                <w:lang w:val="fr-CH"/>
+                                <w:lang w:val="en-GB"/>
                               </w:rPr>
                             </w:pPr>
                             <w:r>
                               <w:rPr>
                                 <w:sz w:val="22"/>
                                 <w:szCs w:val="18"/>
-                                <w:lang w:val="fr-CH"/>
+                                <w:lang w:val="en-GB"/>
                               </w:rPr>
                               <w:t>Average in the year and yesterday</w:t>
                             </w:r>
@@ -2638,7 +2148,7 @@
                               <w:rPr>
                                 <w:sz w:val="22"/>
                                 <w:szCs w:val="18"/>
-                                <w:lang w:val="fr-CH"/>
+                                <w:lang w:val="en-GB"/>
                               </w:rPr>
                               <w:t xml:space="preserve"> comparison</w:t>
                             </w:r>
@@ -2646,7 +2156,7 @@
                               <w:rPr>
                                 <w:sz w:val="22"/>
                                 <w:szCs w:val="18"/>
-                                <w:lang w:val="fr-CH"/>
+                                <w:lang w:val="en-GB"/>
                               </w:rPr>
                               <w:t xml:space="preserve"> are displayed </w:t>
                             </w:r>
@@ -2654,7 +2164,7 @@
                               <w:rPr>
                                 <w:sz w:val="22"/>
                                 <w:szCs w:val="18"/>
-                                <w:lang w:val="fr-CH"/>
+                                <w:lang w:val="en-GB"/>
                               </w:rPr>
                               <w:t>below</w:t>
                             </w:r>
@@ -2681,7 +2191,7 @@
           </mc:Choice>
           <mc:Fallback>
             <w:pict>
-              <v:shape w14:anchorId="3D464789" id="_x0000_s1031" type="#_x0000_t80" style="position:absolute;margin-left:366.55pt;margin-top:32.9pt;width:133.1pt;height:74.25pt;z-index:251741184;visibility:visible;mso-wrap-style:square;mso-width-percent:0;mso-height-percent:0;mso-wrap-distance-left:9pt;mso-wrap-distance-top:0;mso-wrap-distance-right:9pt;mso-wrap-distance-bottom:0;mso-position-horizontal:absolute;mso-position-horizontal-relative:margin;mso-position-vertical:absolute;mso-position-vertical-relative:text;mso-width-percent:0;mso-height-percent:0;mso-width-relative:margin;mso-height-relative:margin;v-text-anchor:middle" o:gfxdata="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" adj="15343,9891,15136,9891" fillcolor="white [3201]" strokecolor="#bfbfbf [2412]" strokeweight="1pt">
+              <v:shape w14:anchorId="3D464789" id="_x0000_s1029" type="#_x0000_t80" style="position:absolute;margin-left:366.55pt;margin-top:32.9pt;width:133.1pt;height:74.25pt;z-index:251741184;visibility:visible;mso-wrap-style:square;mso-width-percent:0;mso-height-percent:0;mso-wrap-distance-left:9pt;mso-wrap-distance-top:0;mso-wrap-distance-right:9pt;mso-wrap-distance-bottom:0;mso-position-horizontal:absolute;mso-position-horizontal-relative:margin;mso-position-vertical:absolute;mso-position-vertical-relative:text;mso-width-percent:0;mso-height-percent:0;mso-width-relative:margin;mso-height-relative:margin;v-text-anchor:middle" o:gfxdata="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" adj="15343,9891,15136,9891" fillcolor="white [3201]" strokecolor="#bfbfbf [2412]" strokeweight="1pt">
                 <v:textbox>
                   <w:txbxContent>
                     <w:p>
@@ -2690,109 +2200,41 @@
                         <w:rPr>
                           <w:sz w:val="22"/>
                           <w:szCs w:val="18"/>
-                          <w:lang w:val="fr-CH"/>
+                          <w:lang w:val="en-GB"/>
                         </w:rPr>
                       </w:pPr>
-                      <w:proofErr w:type="spellStart"/>
                       <w:r>
                         <w:rPr>
                           <w:sz w:val="22"/>
                           <w:szCs w:val="18"/>
-                          <w:lang w:val="fr-CH"/>
+                          <w:lang w:val="en-GB"/>
                         </w:rPr>
-                        <w:t>Average</w:t>
+                        <w:t>Average in the year and yesterday</w:t>
                       </w:r>
-                      <w:proofErr w:type="spellEnd"/>
                       <w:r>
                         <w:rPr>
                           <w:sz w:val="22"/>
                           <w:szCs w:val="18"/>
-                          <w:lang w:val="fr-CH"/>
+                          <w:lang w:val="en-GB"/>
                         </w:rPr>
-                        <w:t xml:space="preserve"> in the </w:t>
+                        <w:t xml:space="preserve"> comparison</w:t>
                       </w:r>
-                      <w:proofErr w:type="spellStart"/>
                       <w:r>
                         <w:rPr>
                           <w:sz w:val="22"/>
                           <w:szCs w:val="18"/>
-                          <w:lang w:val="fr-CH"/>
+                          <w:lang w:val="en-GB"/>
                         </w:rPr>
-                        <w:t>year</w:t>
+                        <w:t xml:space="preserve"> are displayed </w:t>
                       </w:r>
-                      <w:proofErr w:type="spellEnd"/>
                       <w:r>
                         <w:rPr>
                           <w:sz w:val="22"/>
                           <w:szCs w:val="18"/>
-                          <w:lang w:val="fr-CH"/>
-                        </w:rPr>
-                        <w:t xml:space="preserve"> and </w:t>
-                      </w:r>
-                      <w:proofErr w:type="spellStart"/>
-                      <w:r>
-                        <w:rPr>
-                          <w:sz w:val="22"/>
-                          <w:szCs w:val="18"/>
-                          <w:lang w:val="fr-CH"/>
-                        </w:rPr>
-                        <w:t>yesterday</w:t>
-                      </w:r>
-                      <w:proofErr w:type="spellEnd"/>
-                      <w:r>
-                        <w:rPr>
-                          <w:sz w:val="22"/>
-                          <w:szCs w:val="18"/>
-                          <w:lang w:val="fr-CH"/>
-                        </w:rPr>
-                        <w:t xml:space="preserve"> </w:t>
-                      </w:r>
-                      <w:proofErr w:type="spellStart"/>
-                      <w:r>
-                        <w:rPr>
-                          <w:sz w:val="22"/>
-                          <w:szCs w:val="18"/>
-                          <w:lang w:val="fr-CH"/>
-                        </w:rPr>
-                        <w:t>comparison</w:t>
-                      </w:r>
-                      <w:proofErr w:type="spellEnd"/>
-                      <w:r>
-                        <w:rPr>
-                          <w:sz w:val="22"/>
-                          <w:szCs w:val="18"/>
-                          <w:lang w:val="fr-CH"/>
-                        </w:rPr>
-                        <w:t xml:space="preserve"> are </w:t>
-                      </w:r>
-                      <w:proofErr w:type="spellStart"/>
-                      <w:r>
-                        <w:rPr>
-                          <w:sz w:val="22"/>
-                          <w:szCs w:val="18"/>
-                          <w:lang w:val="fr-CH"/>
-                        </w:rPr>
-                        <w:t>displayed</w:t>
-                      </w:r>
-                      <w:proofErr w:type="spellEnd"/>
-                      <w:r>
-                        <w:rPr>
-                          <w:sz w:val="22"/>
-                          <w:szCs w:val="18"/>
-                          <w:lang w:val="fr-CH"/>
-                        </w:rPr>
-                        <w:t xml:space="preserve"> </w:t>
-                      </w:r>
-                      <w:proofErr w:type="spellStart"/>
-                      <w:r>
-                        <w:rPr>
-                          <w:sz w:val="22"/>
-                          <w:szCs w:val="18"/>
-                          <w:lang w:val="fr-CH"/>
+                          <w:lang w:val="en-GB"/>
                         </w:rPr>
                         <w:t>below</w:t>
                       </w:r>
-                      <w:proofErr w:type="spellEnd"/>
                     </w:p>
                   </w:txbxContent>
                 </v:textbox>
@@ -2803,9 +2245,6 @@
         </mc:AlternateContent>
       </w:r>
       <w:r>
-        <w:rPr>
-          <w:noProof/>
-        </w:rPr>
         <w:drawing>
           <wp:anchor distT="0" distB="0" distL="114300" distR="114300" simplePos="0" relativeHeight="251729920" behindDoc="0" locked="0" layoutInCell="1" allowOverlap="1" wp14:anchorId="53751DE3" wp14:editId="74A12FD9">
             <wp:simplePos x="0" y="0"/>
@@ -2895,9 +2334,6 @@
     <w:p/>
     <w:p>
       <w:r>
-        <w:rPr>
-          <w:noProof/>
-        </w:rPr>
         <w:drawing>
           <wp:anchor distT="0" distB="0" distL="114300" distR="114300" simplePos="0" relativeHeight="251731968" behindDoc="0" locked="0" layoutInCell="1" allowOverlap="1" wp14:anchorId="5504887E" wp14:editId="27665F7B">
             <wp:simplePos x="0" y="0"/>
@@ -2998,6 +2434,7 @@
     <w:p/>
     <w:p>
       <w:r>
+        <w:lastRenderedPageBreak/>
         <w:t>This table shows a sample of all the data recorded for a multiple room</w:t>
       </w:r>
       <w:r>
@@ -3006,9 +2443,6 @@
     </w:p>
     <w:p>
       <w:r>
-        <w:rPr>
-          <w:noProof/>
-        </w:rPr>
         <w:drawing>
           <wp:anchor distT="0" distB="0" distL="114300" distR="114300" simplePos="0" relativeHeight="251727872" behindDoc="0" locked="0" layoutInCell="1" allowOverlap="1" wp14:anchorId="40A04386" wp14:editId="6405AEF6">
             <wp:simplePos x="0" y="0"/>
@@ -3091,7 +2525,7 @@
     </w:p>
     <w:p>
       <w:pPr>
-        <w:pStyle w:val="Titre1"/>
+        <w:pStyle w:val="Heading1"/>
       </w:pPr>
       <w:bookmarkStart w:id="5" w:name="_Toc228282260"/>
       <w:r>
@@ -3109,9 +2543,6 @@
     </w:p>
     <w:p>
       <w:r>
-        <w:rPr>
-          <w:noProof/>
-        </w:rPr>
         <w:drawing>
           <wp:inline distT="0" distB="0" distL="0" distR="0" wp14:anchorId="56810653" wp14:editId="39CCAC56">
             <wp:extent cx="6645910" cy="1295400"/>
@@ -3180,9 +2611,6 @@
     </w:p>
     <w:p>
       <w:r>
-        <w:rPr>
-          <w:noProof/>
-        </w:rPr>
         <w:drawing>
           <wp:inline distT="0" distB="0" distL="0" distR="0" wp14:anchorId="6EB5F1FD" wp14:editId="55117B9B">
             <wp:extent cx="6645275" cy="1836420"/>
@@ -3249,6 +2677,7 @@
     <w:p/>
     <w:p>
       <w:r>
+        <w:lastRenderedPageBreak/>
         <w:t xml:space="preserve">To better understand your consumption, this page </w:t>
       </w:r>
       <w:r>
@@ -3275,9 +2704,6 @@
     </w:p>
     <w:p>
       <w:r>
-        <w:rPr>
-          <w:noProof/>
-        </w:rPr>
         <w:drawing>
           <wp:inline distT="0" distB="0" distL="0" distR="0" wp14:anchorId="40123915" wp14:editId="1624B260">
             <wp:extent cx="6619741" cy="2255979"/>
@@ -3341,7 +2767,7 @@
     <w:p/>
     <w:p>
       <w:pPr>
-        <w:pStyle w:val="Titre1"/>
+        <w:pStyle w:val="Heading1"/>
       </w:pPr>
       <w:bookmarkStart w:id="6" w:name="_Toc228282261"/>
       <w:r>
@@ -3362,9 +2788,6 @@
     </w:p>
     <w:p>
       <w:r>
-        <w:rPr>
-          <w:noProof/>
-        </w:rPr>
         <w:drawing>
           <wp:inline distT="0" distB="0" distL="0" distR="0" wp14:anchorId="0E170DDA" wp14:editId="572CB7FF">
             <wp:extent cx="6645910" cy="1268095"/>
@@ -3419,9 +2842,6 @@
     </w:p>
     <w:p>
       <w:r>
-        <w:rPr>
-          <w:noProof/>
-        </w:rPr>
         <w:drawing>
           <wp:inline distT="0" distB="0" distL="0" distR="0" wp14:anchorId="26627E9F" wp14:editId="00FBEDB4">
             <wp:extent cx="6645270" cy="1641231"/>
@@ -3485,33 +2905,30 @@
     <w:p/>
     <w:p>
       <w:r>
+        <w:t xml:space="preserve">The last section of the page shows the daily presence for seven days and </w:t>
+      </w:r>
+      <w:r>
+        <w:t>on</w:t>
+      </w:r>
+      <w:r>
+        <w:t xml:space="preserve"> the </w:t>
+      </w:r>
+      <w:r>
+        <w:t>table,</w:t>
+      </w:r>
+      <w:r>
+        <w:t xml:space="preserve"> it </w:t>
+      </w:r>
+      <w:r>
+        <w:t>shows</w:t>
+      </w:r>
+      <w:r>
+        <w:t xml:space="preserve"> in much more detail motion or door open and presence in a room at a specific hour.</w:t>
+      </w:r>
+    </w:p>
+    <w:p>
+      <w:r>
         <w:lastRenderedPageBreak/>
-        <w:t xml:space="preserve">The last section of the page shows the daily presence for seven days and </w:t>
-      </w:r>
-      <w:r>
-        <w:t>on</w:t>
-      </w:r>
-      <w:r>
-        <w:t xml:space="preserve"> the </w:t>
-      </w:r>
-      <w:r>
-        <w:t>table,</w:t>
-      </w:r>
-      <w:r>
-        <w:t xml:space="preserve"> it </w:t>
-      </w:r>
-      <w:r>
-        <w:t>shows</w:t>
-      </w:r>
-      <w:r>
-        <w:t xml:space="preserve"> in much more detail motion or door open and presence in a room at a specific hour.</w:t>
-      </w:r>
-    </w:p>
-    <w:p>
-      <w:r>
-        <w:rPr>
-          <w:noProof/>
-        </w:rPr>
         <mc:AlternateContent>
           <mc:Choice Requires="wps">
             <w:drawing>
@@ -3642,25 +3059,7 @@
           </mc:Choice>
           <mc:Fallback>
             <w:pict>
-              <v:shapetype w14:anchorId="3033C19D" id="_x0000_t80" coordsize="21600,21600" o:spt="80" adj="14400,5400,18000,8100" path="m,l21600,,21600@0@5@0@5@2@4@2,10800,21600@1@2@3@2@3@0,0@0xe">
-                <v:stroke joinstyle="miter"/>
-                <v:formulas>
-                  <v:f eqn="val #0"/>
-                  <v:f eqn="val #1"/>
-                  <v:f eqn="val #2"/>
-                  <v:f eqn="val #3"/>
-                  <v:f eqn="sum 21600 0 #1"/>
-                  <v:f eqn="sum 21600 0 #3"/>
-                  <v:f eqn="prod #0 1 2"/>
-                </v:formulas>
-                <v:path o:connecttype="custom" o:connectlocs="10800,0;0,@6;10800,21600;21600,@6" o:connectangles="270,180,90,0" textboxrect="0,0,21600,@0"/>
-                <v:handles>
-                  <v:h position="topLeft,#0" yrange="0,@2"/>
-                  <v:h position="#1,bottomRight" xrange="0,@3"/>
-                  <v:h position="#3,#2" xrange="@1,10800" yrange="@0,21600"/>
-                </v:handles>
-              </v:shapetype>
-              <v:shape id="_x0000_s1032" type="#_x0000_t80" style="position:absolute;margin-left:136.5pt;margin-top:26.75pt;width:108pt;height:63.45pt;z-index:251678720;visibility:visible;mso-wrap-style:square;mso-width-percent:0;mso-height-percent:0;mso-wrap-distance-left:9pt;mso-wrap-distance-top:0;mso-wrap-distance-right:9pt;mso-wrap-distance-bottom:0;mso-position-horizontal:absolute;mso-position-horizontal-relative:margin;mso-position-vertical:absolute;mso-position-vertical-relative:text;mso-width-percent:0;mso-height-percent:0;mso-width-relative:margin;mso-height-relative:margin;v-text-anchor:middle" o:gfxdata="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" adj="15343,9843,14001,9843" fillcolor="white [3201]" strokecolor="#bfbfbf [2412]" strokeweight="1pt">
+              <v:shape w14:anchorId="3033C19D" id="_x0000_s1030" type="#_x0000_t80" style="position:absolute;margin-left:136.5pt;margin-top:26.75pt;width:108pt;height:63.45pt;z-index:251678720;visibility:visible;mso-wrap-style:square;mso-width-percent:0;mso-height-percent:0;mso-wrap-distance-left:9pt;mso-wrap-distance-top:0;mso-wrap-distance-right:9pt;mso-wrap-distance-bottom:0;mso-position-horizontal:absolute;mso-position-horizontal-relative:margin;mso-position-vertical:absolute;mso-position-vertical-relative:text;mso-width-percent:0;mso-height-percent:0;mso-width-relative:margin;mso-height-relative:margin;v-text-anchor:middle" o:gfxdata="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" adj="15343,9843,14001,9843" fillcolor="white [3201]" strokecolor="#bfbfbf [2412]" strokeweight="1pt">
                 <v:textbox>
                   <w:txbxContent>
                     <w:p>
@@ -3723,9 +3122,6 @@
         </mc:AlternateContent>
       </w:r>
       <w:r>
-        <w:rPr>
-          <w:noProof/>
-        </w:rPr>
         <w:drawing>
           <wp:inline distT="0" distB="0" distL="0" distR="0" wp14:anchorId="4AE05379" wp14:editId="5B640C0E">
             <wp:extent cx="6645910" cy="1917700"/>
@@ -3789,7 +3185,7 @@
     <w:p/>
     <w:p>
       <w:pPr>
-        <w:pStyle w:val="Titre1"/>
+        <w:pStyle w:val="Heading1"/>
       </w:pPr>
       <w:bookmarkStart w:id="7" w:name="_Toc228282262"/>
       <w:r>
@@ -3801,19 +3197,9 @@
       <w:r>
         <w:t>This page aims to provide a detailed view of the device in the apartment. In the first section of the page, it shows the KPIs of all the devices to check if all is up and running.</w:t>
       </w:r>
-      <w:r/>
-      <w:r/>
-      <w:r/>
-      <w:r/>
-      <w:r/>
-      <w:r/>
-      <w:r/>
-    </w:p>
-    <w:p>
-      <w:r>
-        <w:rPr>
-          <w:noProof/>
-        </w:rPr>
+    </w:p>
+    <w:p>
+      <w:r>
         <w:drawing>
           <wp:inline distT="0" distB="0" distL="0" distR="0" wp14:anchorId="450545B7" wp14:editId="5FF1E611">
             <wp:extent cx="6645910" cy="1299210"/>
@@ -3856,14 +3242,9 @@
       <w:r>
         <w:t>This table shows a sample of the device uptime and error to check whether all devices are online or any are offline.</w:t>
       </w:r>
-      <w:r/>
-      <w:r/>
-    </w:p>
-    <w:p>
-      <w:r>
-        <w:rPr>
-          <w:noProof/>
-        </w:rPr>
+    </w:p>
+    <w:p>
+      <w:r>
         <w:drawing>
           <wp:inline distT="0" distB="0" distL="0" distR="0" wp14:anchorId="4412FC01" wp14:editId="07F3D98A">
             <wp:extent cx="6645910" cy="1760855"/>
@@ -3905,16 +3286,12 @@
     <w:p/>
     <w:p>
       <w:r>
-        <w:rPr>
-          <w:i/>
-          <w:color w:val="2E5BFF"/>
-        </w:rPr>
         <w:t>Reminder — Power BI Desktop displays a snapshot of the data taken at refresh time. To pull the latest values, click Home → Refresh (or press Ctrl+R) before reading the dashboards.</w:t>
       </w:r>
     </w:p>
     <w:p>
       <w:pPr>
-        <w:pStyle w:val="Titre1"/>
+        <w:pStyle w:val="Heading1"/>
       </w:pPr>
       <w:bookmarkStart w:id="8" w:name="_Toc228282263"/>
       <w:r>
@@ -3949,7 +3326,7 @@
     <w:p/>
     <w:p>
       <w:pPr>
-        <w:pStyle w:val="Titre1"/>
+        <w:pStyle w:val="Heading1"/>
       </w:pPr>
       <w:bookmarkStart w:id="9" w:name="_Toc228282264"/>
       <w:r>
@@ -3959,51 +3336,19 @@
     </w:p>
     <w:p>
       <w:pPr>
-        <w:pStyle w:val="Paragraphedeliste"/>
+        <w:pStyle w:val="ListParagraph"/>
         <w:numPr>
           <w:ilvl w:val="0"/>
           <w:numId w:val="1"/>
         </w:numPr>
-        <w:rPr>
-          <w:b/>
-          <w:bCs/>
-        </w:rPr>
-      </w:pPr>
-      <w:r>
-        <w:rPr>
-          <w:b/>
-          <w:bCs/>
-        </w:rPr>
+      </w:pPr>
+      <w:r>
         <w:t>Why are some fields displaying “--” or “No data”?</w:t>
       </w:r>
-      <w:r>
-        <w:rPr>
-          <w:b/>
-          <w:bCs/>
-        </w:rPr>
-      </w:r>
-      <w:r>
-        <w:rPr>
-          <w:b/>
-          <w:bCs/>
-        </w:rPr>
-      </w:r>
-      <w:r>
-        <w:rPr>
-          <w:b/>
-          <w:bCs/>
-        </w:rPr>
-      </w:r>
-      <w:r>
-        <w:rPr>
-          <w:b/>
-          <w:bCs/>
-        </w:rPr>
-      </w:r>
-    </w:p>
-    <w:p>
-      <w:pPr>
-        <w:pStyle w:val="Paragraphedeliste"/>
+    </w:p>
+    <w:p>
+      <w:pPr>
+        <w:pStyle w:val="ListParagraph"/>
       </w:pPr>
       <w:r>
         <w:t>There is no data for this</w:t>
@@ -4026,32 +3371,24 @@
     </w:p>
     <w:p>
       <w:pPr>
-        <w:pStyle w:val="Paragraphedeliste"/>
-      </w:pPr>
-    </w:p>
-    <w:p>
-      <w:pPr>
-        <w:pStyle w:val="Paragraphedeliste"/>
+        <w:pStyle w:val="ListParagraph"/>
+      </w:pPr>
+    </w:p>
+    <w:p>
+      <w:pPr>
+        <w:pStyle w:val="ListParagraph"/>
         <w:numPr>
           <w:ilvl w:val="0"/>
           <w:numId w:val="5"/>
         </w:numPr>
-        <w:rPr>
-          <w:b/>
-          <w:bCs/>
-        </w:rPr>
-      </w:pPr>
-      <w:r>
-        <w:rPr>
-          <w:b/>
-          <w:bCs/>
-        </w:rPr>
+      </w:pPr>
+      <w:r>
         <w:t>Can I isolate a single value in a graph?</w:t>
       </w:r>
     </w:p>
     <w:p>
       <w:pPr>
-        <w:pStyle w:val="Paragraphedeliste"/>
+        <w:pStyle w:val="ListParagraph"/>
       </w:pPr>
       <w:r>
         <w:t>You can select one element in the filter, and it will show only the data for this one.</w:t>
@@ -4059,38 +3396,24 @@
     </w:p>
     <w:p>
       <w:pPr>
-        <w:pStyle w:val="Paragraphedeliste"/>
-      </w:pPr>
-    </w:p>
-    <w:p>
-      <w:pPr>
-        <w:pStyle w:val="Paragraphedeliste"/>
+        <w:pStyle w:val="ListParagraph"/>
+      </w:pPr>
+    </w:p>
+    <w:p>
+      <w:pPr>
+        <w:pStyle w:val="ListParagraph"/>
         <w:numPr>
           <w:ilvl w:val="0"/>
           <w:numId w:val="5"/>
         </w:numPr>
-        <w:rPr>
-          <w:b/>
-          <w:bCs/>
-        </w:rPr>
-      </w:pPr>
-      <w:r>
-        <w:rPr>
-          <w:b/>
-          <w:bCs/>
-        </w:rPr>
+      </w:pPr>
+      <w:r>
         <w:t>Is the filter synchronized across pages?</w:t>
       </w:r>
-      <w:r>
-        <w:rPr>
-          <w:b/>
-          <w:bCs/>
-        </w:rPr>
-      </w:r>
-    </w:p>
-    <w:p>
-      <w:pPr>
-        <w:pStyle w:val="Paragraphedeliste"/>
+    </w:p>
+    <w:p>
+      <w:pPr>
+        <w:pStyle w:val="ListParagraph"/>
       </w:pPr>
       <w:r>
         <w:t>Yes — selections in the slicers apply across every page of the report.</w:t>
@@ -4098,38 +3421,28 @@
     </w:p>
     <w:p>
       <w:pPr>
-        <w:pStyle w:val="Paragraphedeliste"/>
-      </w:pPr>
-    </w:p>
-    <w:p>
-      <w:pPr>
-        <w:pStyle w:val="Paragraphedeliste"/>
+        <w:pStyle w:val="ListParagraph"/>
+      </w:pPr>
+    </w:p>
+    <w:p>
+      <w:pPr>
+        <w:pStyle w:val="ListParagraph"/>
         <w:numPr>
           <w:ilvl w:val="0"/>
           <w:numId w:val="5"/>
         </w:numPr>
-        <w:rPr>
-          <w:b/>
-          <w:bCs/>
-        </w:rPr>
-      </w:pPr>
-      <w:r>
-        <w:rPr>
-          <w:b/>
-          <w:bCs/>
-        </w:rPr>
+      </w:pPr>
+      <w:r>
         <w:t>How often is the data updated?</w:t>
       </w:r>
     </w:p>
     <w:p>
       <w:pPr>
-        <w:pStyle w:val="Paragraphedeliste"/>
+        <w:pStyle w:val="ListParagraph"/>
       </w:pPr>
       <w:r>
         <w:t>The pipeline keeps the database fresh in the background — sensor readings every minute, gold facts every 15 minutes, and ML predictions daily at 06:30. Power BI Desktop loads a snapshot of this data when you open the file: click Home → Refresh (or press Ctrl+R) to pull the latest values.</w:t>
       </w:r>
-      <w:r/>
-      <w:r/>
     </w:p>
     <w:p/>
     <w:p/>
@@ -4176,7 +3489,7 @@
 <w:ftr xmlns:wpc="http://schemas.microsoft.com/office/word/2010/wordprocessingCanvas" xmlns:cx="http://schemas.microsoft.com/office/drawing/2014/chartex" xmlns:cx1="http://schemas.microsoft.com/office/drawing/2015/9/8/chartex" xmlns:cx2="http://schemas.microsoft.com/office/drawing/2015/10/21/chartex" xmlns:cx3="http://schemas.microsoft.com/office/drawing/2016/5/9/chartex" xmlns:cx4="http://schemas.microsoft.com/office/drawing/2016/5/10/chartex" xmlns:cx5="http://schemas.microsoft.com/office/drawing/2016/5/11/chartex" xmlns:cx6="http://schemas.microsoft.com/office/drawing/2016/5/12/chartex" xmlns:cx7="http://schemas.microsoft.com/office/drawing/2016/5/13/chartex" xmlns:cx8="http://schemas.microsoft.com/office/drawing/2016/5/14/chartex" xmlns:mc="http://schemas.openxmlformats.org/markup-compatibility/2006" xmlns:aink="http://schemas.microsoft.com/office/drawing/2016/ink" xmlns:am3d="http://schemas.microsoft.com/office/drawing/2017/model3d" xmlns:o="urn:schemas-microsoft-com:office:office" xmlns:oel="http://schemas.microsoft.com/office/2019/extlst" xmlns:r="http://schemas.openxmlformats.org/officeDocument/2006/relationships" xmlns:m="http://schemas.openxmlformats.org/officeDocument/2006/math" xmlns:v="urn:schemas-microsoft-com:vml" xmlns:wp14="http://schemas.microsoft.com/office/word/2010/wordprocessingDrawing" xmlns:wp="http://schemas.openxmlformats.org/drawingml/2006/wordprocessingDrawing" xmlns:w10="urn:schemas-microsoft-com:office:word" xmlns:w="http://schemas.openxmlformats.org/wordprocessingml/2006/main" xmlns:w14="http://schemas.microsoft.com/office/word/2010/wordml" xmlns:w15="http://schemas.microsoft.com/office/word/2012/wordml" xmlns:w16cex="http://schemas.microsoft.com/office/word/2018/wordml/cex" xmlns:w16cid="http://schemas.microsoft.com/office/word/2016/wordml/cid" xmlns:w16="http://schemas.microsoft.com/office/word/2018/wordml" xmlns:w16du="http://schemas.microsoft.com/office/word/2023/wordml/word16du" xmlns:w16sdtdh="http://schemas.microsoft.com/office/word/2020/wordml/sdtdatahash" xmlns:w16sdtfl="http://schemas.microsoft.com/office/word/2024/wordml/sdtformatlock" xmlns:w16se="http://schemas.microsoft.com/office/word/2015/wordml/symex" xmlns:wpg="http://schemas.microsoft.com/office/word/2010/wordprocessingGroup" xmlns:wpi="http://schemas.microsoft.com/office/word/2010/wordprocessingInk" xmlns:wne="http://schemas.microsoft.com/office/word/2006/wordml" xmlns:wps="http://schemas.microsoft.com/office/word/2010/wordprocessingShape" mc:Ignorable="w14 w15 w16se w16cid w16 w16cex w16sdtdh w16sdtfl w16du wp14">
   <w:p>
     <w:pPr>
-      <w:pStyle w:val="Pieddepage"/>
+      <w:pStyle w:val="Footer"/>
     </w:pPr>
     <w:r>
       <w:rPr>
@@ -4246,7 +3559,7 @@
         </mc:Choice>
         <mc:Fallback>
           <w:pict>
-            <v:shapetype w14:anchorId="450C4D83" id="_x0000_t7" coordsize="21600,21600" o:spt="7" adj="5400" path="m@0,l,21600@1,21600,21600,xe">
+            <v:shapetype w14:anchorId="4C91A8DC" id="_x0000_t7" coordsize="21600,21600" o:spt="7" adj="5400" path="m@0,l,21600@1,21600,21600,xe">
               <v:stroke joinstyle="miter"/>
               <v:formulas>
                 <v:f eqn="val #0"/>
@@ -4306,7 +3619,7 @@
 <w:hdr xmlns:wpc="http://schemas.microsoft.com/office/word/2010/wordprocessingCanvas" xmlns:cx="http://schemas.microsoft.com/office/drawing/2014/chartex" xmlns:cx1="http://schemas.microsoft.com/office/drawing/2015/9/8/chartex" xmlns:cx2="http://schemas.microsoft.com/office/drawing/2015/10/21/chartex" xmlns:cx3="http://schemas.microsoft.com/office/drawing/2016/5/9/chartex" xmlns:cx4="http://schemas.microsoft.com/office/drawing/2016/5/10/chartex" xmlns:cx5="http://schemas.microsoft.com/office/drawing/2016/5/11/chartex" xmlns:cx6="http://schemas.microsoft.com/office/drawing/2016/5/12/chartex" xmlns:cx7="http://schemas.microsoft.com/office/drawing/2016/5/13/chartex" xmlns:cx8="http://schemas.microsoft.com/office/drawing/2016/5/14/chartex" xmlns:mc="http://schemas.openxmlformats.org/markup-compatibility/2006" xmlns:aink="http://schemas.microsoft.com/office/drawing/2016/ink" xmlns:am3d="http://schemas.microsoft.com/office/drawing/2017/model3d" xmlns:o="urn:schemas-microsoft-com:office:office" xmlns:oel="http://schemas.microsoft.com/office/2019/extlst" xmlns:r="http://schemas.openxmlformats.org/officeDocument/2006/relationships" xmlns:m="http://schemas.openxmlformats.org/officeDocument/2006/math" xmlns:v="urn:schemas-microsoft-com:vml" xmlns:wp14="http://schemas.microsoft.com/office/word/2010/wordprocessingDrawing" xmlns:wp="http://schemas.openxmlformats.org/drawingml/2006/wordprocessingDrawing" xmlns:w10="urn:schemas-microsoft-com:office:word" xmlns:w="http://schemas.openxmlformats.org/wordprocessingml/2006/main" xmlns:w14="http://schemas.microsoft.com/office/word/2010/wordml" xmlns:w15="http://schemas.microsoft.com/office/word/2012/wordml" xmlns:w16cex="http://schemas.microsoft.com/office/word/2018/wordml/cex" xmlns:w16cid="http://schemas.microsoft.com/office/word/2016/wordml/cid" xmlns:w16="http://schemas.microsoft.com/office/word/2018/wordml" xmlns:w16du="http://schemas.microsoft.com/office/word/2023/wordml/word16du" xmlns:w16sdtdh="http://schemas.microsoft.com/office/word/2020/wordml/sdtdatahash" xmlns:w16sdtfl="http://schemas.microsoft.com/office/word/2024/wordml/sdtformatlock" xmlns:w16se="http://schemas.microsoft.com/office/word/2015/wordml/symex" xmlns:wpg="http://schemas.microsoft.com/office/word/2010/wordprocessingGroup" xmlns:wpi="http://schemas.microsoft.com/office/word/2010/wordprocessingInk" xmlns:wne="http://schemas.microsoft.com/office/word/2006/wordml" xmlns:wps="http://schemas.microsoft.com/office/word/2010/wordprocessingShape" mc:Ignorable="w14 w15 w16se w16cid w16 w16cex w16sdtdh w16sdtfl w16du wp14">
   <w:p>
     <w:pPr>
-      <w:pStyle w:val="En-tte"/>
+      <w:pStyle w:val="Header"/>
     </w:pPr>
     <w:r>
       <w:rPr>
@@ -4376,7 +3689,7 @@
         </mc:Choice>
         <mc:Fallback>
           <w:pict>
-            <v:shapetype w14:anchorId="4D58917A" id="_x0000_t7" coordsize="21600,21600" o:spt="7" adj="5400" path="m@0,l,21600@1,21600,21600,xe">
+            <v:shapetype w14:anchorId="44BBE7AA" id="_x0000_t7" coordsize="21600,21600" o:spt="7" adj="5400" path="m@0,l,21600@1,21600,21600,xe">
               <v:stroke joinstyle="miter"/>
               <v:formulas>
                 <v:f eqn="val #0"/>
@@ -4994,17 +4307,15 @@
   <w:docDefaults>
     <w:rPrDefault>
       <w:rPr>
-        <w:rFonts w:asciiTheme="minorHAnsi" w:eastAsiaTheme="minorHAnsi" w:hAnsiTheme="minorHAnsi" w:cstheme="minorBidi"/>
-        <w:kern w:val="2"/>
-        <w:sz w:val="22"/>
-        <w:szCs w:val="22"/>
+        <w:rFonts w:asciiTheme="minorHAnsi" w:eastAsiaTheme="minorEastAsia" w:hAnsiTheme="minorHAnsi" w:cstheme="minorBidi"/>
+        <w:sz w:val="24"/>
+        <w:szCs w:val="24"/>
         <w:lang w:val="fr-CH" w:eastAsia="en-US" w:bidi="ar-SA"/>
-        <w14:ligatures w14:val="standardContextual"/>
       </w:rPr>
     </w:rPrDefault>
     <w:pPrDefault>
       <w:pPr>
-        <w:spacing w:after="160" w:line="259" w:lineRule="auto"/>
+        <w:spacing w:after="160" w:line="278" w:lineRule="auto"/>
       </w:pPr>
     </w:pPrDefault>
   </w:docDefaults>
@@ -5389,44 +4700,42 @@
   <w:style w:type="paragraph" w:default="1" w:styleId="Normal">
     <w:name w:val="Normal"/>
     <w:qFormat/>
-    <w:rsid w:val="00247489"/>
+    <w:rsid w:val="002D391C"/>
     <w:rPr>
-      <w:sz w:val="28"/>
-      <w:lang w:val="en-US"/>
+      <w:sz w:val="26"/>
     </w:rPr>
   </w:style>
-  <w:style w:type="paragraph" w:styleId="Titre1">
+  <w:style w:type="paragraph" w:styleId="Heading1">
     <w:name w:val="heading 1"/>
     <w:basedOn w:val="Normal"/>
     <w:next w:val="Normal"/>
-    <w:link w:val="Titre1Car"/>
+    <w:link w:val="Heading1Char"/>
     <w:uiPriority w:val="9"/>
     <w:qFormat/>
-    <w:rsid w:val="000E13DB"/>
+    <w:rsid w:val="002D391C"/>
     <w:pPr>
       <w:keepNext/>
       <w:keepLines/>
-      <w:spacing w:before="240" w:after="360" w:line="240" w:lineRule="auto"/>
+      <w:spacing w:before="360" w:after="80"/>
       <w:outlineLvl w:val="0"/>
     </w:pPr>
     <w:rPr>
-      <w:rFonts w:ascii="Segoe Pro" w:eastAsiaTheme="majorEastAsia" w:hAnsi="Segoe Pro" w:cstheme="majorBidi"/>
-      <w:b/>
-      <w:color w:val="262626" w:themeColor="text1" w:themeTint="D9"/>
-      <w:sz w:val="52"/>
+      <w:rFonts w:asciiTheme="majorHAnsi" w:eastAsiaTheme="majorEastAsia" w:hAnsiTheme="majorHAnsi" w:cstheme="majorBidi"/>
+      <w:color w:val="0F4761" w:themeColor="accent1" w:themeShade="BF"/>
+      <w:sz w:val="40"/>
       <w:szCs w:val="40"/>
     </w:rPr>
   </w:style>
-  <w:style w:type="paragraph" w:styleId="Titre2">
+  <w:style w:type="paragraph" w:styleId="Heading2">
     <w:name w:val="heading 2"/>
     <w:basedOn w:val="Normal"/>
     <w:next w:val="Normal"/>
-    <w:link w:val="Titre2Car"/>
+    <w:link w:val="Heading2Char"/>
     <w:uiPriority w:val="9"/>
     <w:semiHidden/>
     <w:unhideWhenUsed/>
     <w:qFormat/>
-    <w:rsid w:val="00C72654"/>
+    <w:rsid w:val="002D391C"/>
     <w:pPr>
       <w:keepNext/>
       <w:keepLines/>
@@ -5440,16 +4749,16 @@
       <w:szCs w:val="32"/>
     </w:rPr>
   </w:style>
-  <w:style w:type="paragraph" w:styleId="Titre3">
+  <w:style w:type="paragraph" w:styleId="Heading3">
     <w:name w:val="heading 3"/>
     <w:basedOn w:val="Normal"/>
     <w:next w:val="Normal"/>
-    <w:link w:val="Titre3Car"/>
+    <w:link w:val="Heading3Char"/>
     <w:uiPriority w:val="9"/>
     <w:semiHidden/>
     <w:unhideWhenUsed/>
     <w:qFormat/>
-    <w:rsid w:val="00C72654"/>
+    <w:rsid w:val="002D391C"/>
     <w:pPr>
       <w:keepNext/>
       <w:keepLines/>
@@ -5459,19 +4768,20 @@
     <w:rPr>
       <w:rFonts w:eastAsiaTheme="majorEastAsia" w:cstheme="majorBidi"/>
       <w:color w:val="0F4761" w:themeColor="accent1" w:themeShade="BF"/>
+      <w:sz w:val="28"/>
       <w:szCs w:val="28"/>
     </w:rPr>
   </w:style>
-  <w:style w:type="paragraph" w:styleId="Titre4">
+  <w:style w:type="paragraph" w:styleId="Heading4">
     <w:name w:val="heading 4"/>
     <w:basedOn w:val="Normal"/>
     <w:next w:val="Normal"/>
-    <w:link w:val="Titre4Car"/>
+    <w:link w:val="Heading4Char"/>
     <w:uiPriority w:val="9"/>
     <w:semiHidden/>
     <w:unhideWhenUsed/>
     <w:qFormat/>
-    <w:rsid w:val="00C72654"/>
+    <w:rsid w:val="002D391C"/>
     <w:pPr>
       <w:keepNext/>
       <w:keepLines/>
@@ -5485,16 +4795,16 @@
       <w:color w:val="0F4761" w:themeColor="accent1" w:themeShade="BF"/>
     </w:rPr>
   </w:style>
-  <w:style w:type="paragraph" w:styleId="Titre5">
+  <w:style w:type="paragraph" w:styleId="Heading5">
     <w:name w:val="heading 5"/>
     <w:basedOn w:val="Normal"/>
     <w:next w:val="Normal"/>
-    <w:link w:val="Titre5Car"/>
+    <w:link w:val="Heading5Char"/>
     <w:uiPriority w:val="9"/>
     <w:semiHidden/>
     <w:unhideWhenUsed/>
     <w:qFormat/>
-    <w:rsid w:val="00C72654"/>
+    <w:rsid w:val="002D391C"/>
     <w:pPr>
       <w:keepNext/>
       <w:keepLines/>
@@ -5506,16 +4816,16 @@
       <w:color w:val="0F4761" w:themeColor="accent1" w:themeShade="BF"/>
     </w:rPr>
   </w:style>
-  <w:style w:type="paragraph" w:styleId="Titre6">
+  <w:style w:type="paragraph" w:styleId="Heading6">
     <w:name w:val="heading 6"/>
     <w:basedOn w:val="Normal"/>
     <w:next w:val="Normal"/>
-    <w:link w:val="Titre6Car"/>
+    <w:link w:val="Heading6Char"/>
     <w:uiPriority w:val="9"/>
     <w:semiHidden/>
     <w:unhideWhenUsed/>
     <w:qFormat/>
-    <w:rsid w:val="00C72654"/>
+    <w:rsid w:val="002D391C"/>
     <w:pPr>
       <w:keepNext/>
       <w:keepLines/>
@@ -5529,16 +4839,16 @@
       <w:color w:val="595959" w:themeColor="text1" w:themeTint="A6"/>
     </w:rPr>
   </w:style>
-  <w:style w:type="paragraph" w:styleId="Titre7">
+  <w:style w:type="paragraph" w:styleId="Heading7">
     <w:name w:val="heading 7"/>
     <w:basedOn w:val="Normal"/>
     <w:next w:val="Normal"/>
-    <w:link w:val="Titre7Car"/>
+    <w:link w:val="Heading7Char"/>
     <w:uiPriority w:val="9"/>
     <w:semiHidden/>
     <w:unhideWhenUsed/>
     <w:qFormat/>
-    <w:rsid w:val="00C72654"/>
+    <w:rsid w:val="002D391C"/>
     <w:pPr>
       <w:keepNext/>
       <w:keepLines/>
@@ -5550,16 +4860,16 @@
       <w:color w:val="595959" w:themeColor="text1" w:themeTint="A6"/>
     </w:rPr>
   </w:style>
-  <w:style w:type="paragraph" w:styleId="Titre8">
+  <w:style w:type="paragraph" w:styleId="Heading8">
     <w:name w:val="heading 8"/>
     <w:basedOn w:val="Normal"/>
     <w:next w:val="Normal"/>
-    <w:link w:val="Titre8Car"/>
+    <w:link w:val="Heading8Char"/>
     <w:uiPriority w:val="9"/>
     <w:semiHidden/>
     <w:unhideWhenUsed/>
     <w:qFormat/>
-    <w:rsid w:val="00C72654"/>
+    <w:rsid w:val="002D391C"/>
     <w:pPr>
       <w:keepNext/>
       <w:keepLines/>
@@ -5573,16 +4883,16 @@
       <w:color w:val="272727" w:themeColor="text1" w:themeTint="D8"/>
     </w:rPr>
   </w:style>
-  <w:style w:type="paragraph" w:styleId="Titre9">
+  <w:style w:type="paragraph" w:styleId="Heading9">
     <w:name w:val="heading 9"/>
     <w:basedOn w:val="Normal"/>
     <w:next w:val="Normal"/>
-    <w:link w:val="Titre9Car"/>
+    <w:link w:val="Heading9Char"/>
     <w:uiPriority w:val="9"/>
     <w:semiHidden/>
     <w:unhideWhenUsed/>
     <w:qFormat/>
-    <w:rsid w:val="00C72654"/>
+    <w:rsid w:val="002D391C"/>
     <w:pPr>
       <w:keepNext/>
       <w:keepLines/>
@@ -5594,13 +4904,12 @@
       <w:color w:val="272727" w:themeColor="text1" w:themeTint="D8"/>
     </w:rPr>
   </w:style>
-  <w:style w:type="character" w:default="1" w:styleId="Policepardfaut">
+  <w:style w:type="character" w:default="1" w:styleId="DefaultParagraphFont">
     <w:name w:val="Default Paragraph Font"/>
     <w:uiPriority w:val="1"/>
-    <w:semiHidden/>
     <w:unhideWhenUsed/>
   </w:style>
-  <w:style w:type="table" w:default="1" w:styleId="TableauNormal">
+  <w:style w:type="table" w:default="1" w:styleId="TableNormal">
     <w:name w:val="Normal Table"/>
     <w:uiPriority w:val="99"/>
     <w:semiHidden/>
@@ -5615,34 +4924,32 @@
       </w:tblCellMar>
     </w:tblPr>
   </w:style>
-  <w:style w:type="numbering" w:default="1" w:styleId="Aucuneliste">
+  <w:style w:type="numbering" w:default="1" w:styleId="NoList">
     <w:name w:val="No List"/>
     <w:uiPriority w:val="99"/>
     <w:semiHidden/>
     <w:unhideWhenUsed/>
   </w:style>
-  <w:style w:type="character" w:customStyle="1" w:styleId="Titre1Car">
-    <w:name w:val="Titre 1 Car"/>
-    <w:basedOn w:val="Policepardfaut"/>
-    <w:link w:val="Titre1"/>
+  <w:style w:type="character" w:customStyle="1" w:styleId="Heading1Char">
+    <w:name w:val="Heading 1 Char"/>
+    <w:basedOn w:val="DefaultParagraphFont"/>
+    <w:link w:val="Heading1"/>
     <w:uiPriority w:val="9"/>
-    <w:rsid w:val="000E13DB"/>
+    <w:rsid w:val="002D391C"/>
     <w:rPr>
-      <w:rFonts w:ascii="Segoe Pro" w:eastAsiaTheme="majorEastAsia" w:hAnsi="Segoe Pro" w:cstheme="majorBidi"/>
-      <w:b/>
-      <w:color w:val="262626" w:themeColor="text1" w:themeTint="D9"/>
-      <w:sz w:val="52"/>
+      <w:rFonts w:asciiTheme="majorHAnsi" w:eastAsiaTheme="majorEastAsia" w:hAnsiTheme="majorHAnsi" w:cstheme="majorBidi"/>
+      <w:color w:val="0F4761" w:themeColor="accent1" w:themeShade="BF"/>
+      <w:sz w:val="40"/>
       <w:szCs w:val="40"/>
-      <w:lang w:val="en-US"/>
     </w:rPr>
   </w:style>
-  <w:style w:type="character" w:customStyle="1" w:styleId="Titre2Car">
-    <w:name w:val="Titre 2 Car"/>
-    <w:basedOn w:val="Policepardfaut"/>
-    <w:link w:val="Titre2"/>
+  <w:style w:type="character" w:customStyle="1" w:styleId="Heading2Char">
+    <w:name w:val="Heading 2 Char"/>
+    <w:basedOn w:val="DefaultParagraphFont"/>
+    <w:link w:val="Heading2"/>
     <w:uiPriority w:val="9"/>
     <w:semiHidden/>
-    <w:rsid w:val="00C72654"/>
+    <w:rsid w:val="002D391C"/>
     <w:rPr>
       <w:rFonts w:asciiTheme="majorHAnsi" w:eastAsiaTheme="majorEastAsia" w:hAnsiTheme="majorHAnsi" w:cstheme="majorBidi"/>
       <w:color w:val="0F4761" w:themeColor="accent1" w:themeShade="BF"/>
@@ -5650,13 +4957,13 @@
       <w:szCs w:val="32"/>
     </w:rPr>
   </w:style>
-  <w:style w:type="character" w:customStyle="1" w:styleId="Titre3Car">
-    <w:name w:val="Titre 3 Car"/>
-    <w:basedOn w:val="Policepardfaut"/>
-    <w:link w:val="Titre3"/>
+  <w:style w:type="character" w:customStyle="1" w:styleId="Heading3Char">
+    <w:name w:val="Heading 3 Char"/>
+    <w:basedOn w:val="DefaultParagraphFont"/>
+    <w:link w:val="Heading3"/>
     <w:uiPriority w:val="9"/>
     <w:semiHidden/>
-    <w:rsid w:val="00C72654"/>
+    <w:rsid w:val="002D391C"/>
     <w:rPr>
       <w:rFonts w:eastAsiaTheme="majorEastAsia" w:cstheme="majorBidi"/>
       <w:color w:val="0F4761" w:themeColor="accent1" w:themeShade="BF"/>
@@ -5664,13 +4971,13 @@
       <w:szCs w:val="28"/>
     </w:rPr>
   </w:style>
-  <w:style w:type="character" w:customStyle="1" w:styleId="Titre4Car">
-    <w:name w:val="Titre 4 Car"/>
-    <w:basedOn w:val="Policepardfaut"/>
-    <w:link w:val="Titre4"/>
+  <w:style w:type="character" w:customStyle="1" w:styleId="Heading4Char">
+    <w:name w:val="Heading 4 Char"/>
+    <w:basedOn w:val="DefaultParagraphFont"/>
+    <w:link w:val="Heading4"/>
     <w:uiPriority w:val="9"/>
     <w:semiHidden/>
-    <w:rsid w:val="00C72654"/>
+    <w:rsid w:val="002D391C"/>
     <w:rPr>
       <w:rFonts w:eastAsiaTheme="majorEastAsia" w:cstheme="majorBidi"/>
       <w:i/>
@@ -5678,25 +4985,25 @@
       <w:color w:val="0F4761" w:themeColor="accent1" w:themeShade="BF"/>
     </w:rPr>
   </w:style>
-  <w:style w:type="character" w:customStyle="1" w:styleId="Titre5Car">
-    <w:name w:val="Titre 5 Car"/>
-    <w:basedOn w:val="Policepardfaut"/>
-    <w:link w:val="Titre5"/>
+  <w:style w:type="character" w:customStyle="1" w:styleId="Heading5Char">
+    <w:name w:val="Heading 5 Char"/>
+    <w:basedOn w:val="DefaultParagraphFont"/>
+    <w:link w:val="Heading5"/>
     <w:uiPriority w:val="9"/>
     <w:semiHidden/>
-    <w:rsid w:val="00C72654"/>
+    <w:rsid w:val="002D391C"/>
     <w:rPr>
       <w:rFonts w:eastAsiaTheme="majorEastAsia" w:cstheme="majorBidi"/>
       <w:color w:val="0F4761" w:themeColor="accent1" w:themeShade="BF"/>
     </w:rPr>
   </w:style>
-  <w:style w:type="character" w:customStyle="1" w:styleId="Titre6Car">
-    <w:name w:val="Titre 6 Car"/>
-    <w:basedOn w:val="Policepardfaut"/>
-    <w:link w:val="Titre6"/>
+  <w:style w:type="character" w:customStyle="1" w:styleId="Heading6Char">
+    <w:name w:val="Heading 6 Char"/>
+    <w:basedOn w:val="DefaultParagraphFont"/>
+    <w:link w:val="Heading6"/>
     <w:uiPriority w:val="9"/>
     <w:semiHidden/>
-    <w:rsid w:val="00C72654"/>
+    <w:rsid w:val="002D391C"/>
     <w:rPr>
       <w:rFonts w:eastAsiaTheme="majorEastAsia" w:cstheme="majorBidi"/>
       <w:i/>
@@ -5704,25 +5011,25 @@
       <w:color w:val="595959" w:themeColor="text1" w:themeTint="A6"/>
     </w:rPr>
   </w:style>
-  <w:style w:type="character" w:customStyle="1" w:styleId="Titre7Car">
-    <w:name w:val="Titre 7 Car"/>
-    <w:basedOn w:val="Policepardfaut"/>
-    <w:link w:val="Titre7"/>
+  <w:style w:type="character" w:customStyle="1" w:styleId="Heading7Char">
+    <w:name w:val="Heading 7 Char"/>
+    <w:basedOn w:val="DefaultParagraphFont"/>
+    <w:link w:val="Heading7"/>
     <w:uiPriority w:val="9"/>
     <w:semiHidden/>
-    <w:rsid w:val="00C72654"/>
+    <w:rsid w:val="002D391C"/>
     <w:rPr>
       <w:rFonts w:eastAsiaTheme="majorEastAsia" w:cstheme="majorBidi"/>
       <w:color w:val="595959" w:themeColor="text1" w:themeTint="A6"/>
     </w:rPr>
   </w:style>
-  <w:style w:type="character" w:customStyle="1" w:styleId="Titre8Car">
-    <w:name w:val="Titre 8 Car"/>
-    <w:basedOn w:val="Policepardfaut"/>
-    <w:link w:val="Titre8"/>
+  <w:style w:type="character" w:customStyle="1" w:styleId="Heading8Char">
+    <w:name w:val="Heading 8 Char"/>
+    <w:basedOn w:val="DefaultParagraphFont"/>
+    <w:link w:val="Heading8"/>
     <w:uiPriority w:val="9"/>
     <w:semiHidden/>
-    <w:rsid w:val="00C72654"/>
+    <w:rsid w:val="002D391C"/>
     <w:rPr>
       <w:rFonts w:eastAsiaTheme="majorEastAsia" w:cstheme="majorBidi"/>
       <w:i/>
@@ -5730,26 +5037,26 @@
       <w:color w:val="272727" w:themeColor="text1" w:themeTint="D8"/>
     </w:rPr>
   </w:style>
-  <w:style w:type="character" w:customStyle="1" w:styleId="Titre9Car">
-    <w:name w:val="Titre 9 Car"/>
-    <w:basedOn w:val="Policepardfaut"/>
-    <w:link w:val="Titre9"/>
+  <w:style w:type="character" w:customStyle="1" w:styleId="Heading9Char">
+    <w:name w:val="Heading 9 Char"/>
+    <w:basedOn w:val="DefaultParagraphFont"/>
+    <w:link w:val="Heading9"/>
     <w:uiPriority w:val="9"/>
     <w:semiHidden/>
-    <w:rsid w:val="00C72654"/>
+    <w:rsid w:val="002D391C"/>
     <w:rPr>
       <w:rFonts w:eastAsiaTheme="majorEastAsia" w:cstheme="majorBidi"/>
       <w:color w:val="272727" w:themeColor="text1" w:themeTint="D8"/>
     </w:rPr>
   </w:style>
-  <w:style w:type="paragraph" w:styleId="Titre">
+  <w:style w:type="paragraph" w:styleId="Title">
     <w:name w:val="Title"/>
     <w:basedOn w:val="Normal"/>
     <w:next w:val="Normal"/>
-    <w:link w:val="TitreCar"/>
+    <w:link w:val="TitleChar"/>
     <w:uiPriority w:val="10"/>
     <w:qFormat/>
-    <w:rsid w:val="00C72654"/>
+    <w:rsid w:val="002D391C"/>
     <w:pPr>
       <w:spacing w:after="80" w:line="240" w:lineRule="auto"/>
       <w:contextualSpacing/>
@@ -5762,12 +5069,12 @@
       <w:szCs w:val="56"/>
     </w:rPr>
   </w:style>
-  <w:style w:type="character" w:customStyle="1" w:styleId="TitreCar">
-    <w:name w:val="Titre Car"/>
-    <w:basedOn w:val="Policepardfaut"/>
-    <w:link w:val="Titre"/>
+  <w:style w:type="character" w:customStyle="1" w:styleId="TitleChar">
+    <w:name w:val="Title Char"/>
+    <w:basedOn w:val="DefaultParagraphFont"/>
+    <w:link w:val="Title"/>
     <w:uiPriority w:val="10"/>
-    <w:rsid w:val="00C72654"/>
+    <w:rsid w:val="002D391C"/>
     <w:rPr>
       <w:rFonts w:asciiTheme="majorHAnsi" w:eastAsiaTheme="majorEastAsia" w:hAnsiTheme="majorHAnsi" w:cstheme="majorBidi"/>
       <w:spacing w:val="-10"/>
@@ -5776,14 +5083,14 @@
       <w:szCs w:val="56"/>
     </w:rPr>
   </w:style>
-  <w:style w:type="paragraph" w:styleId="Sous-titre">
+  <w:style w:type="paragraph" w:styleId="Subtitle">
     <w:name w:val="Subtitle"/>
     <w:basedOn w:val="Normal"/>
     <w:next w:val="Normal"/>
-    <w:link w:val="Sous-titreCar"/>
+    <w:link w:val="SubtitleChar"/>
     <w:uiPriority w:val="11"/>
     <w:qFormat/>
-    <w:rsid w:val="00C72654"/>
+    <w:rsid w:val="002D391C"/>
     <w:pPr>
       <w:numPr>
         <w:ilvl w:val="1"/>
@@ -5793,15 +5100,16 @@
       <w:rFonts w:eastAsiaTheme="majorEastAsia" w:cstheme="majorBidi"/>
       <w:color w:val="595959" w:themeColor="text1" w:themeTint="A6"/>
       <w:spacing w:val="15"/>
+      <w:sz w:val="28"/>
       <w:szCs w:val="28"/>
     </w:rPr>
   </w:style>
-  <w:style w:type="character" w:customStyle="1" w:styleId="Sous-titreCar">
-    <w:name w:val="Sous-titre Car"/>
-    <w:basedOn w:val="Policepardfaut"/>
-    <w:link w:val="Sous-titre"/>
+  <w:style w:type="character" w:customStyle="1" w:styleId="SubtitleChar">
+    <w:name w:val="Subtitle Char"/>
+    <w:basedOn w:val="DefaultParagraphFont"/>
+    <w:link w:val="Subtitle"/>
     <w:uiPriority w:val="11"/>
-    <w:rsid w:val="00C72654"/>
+    <w:rsid w:val="002D391C"/>
     <w:rPr>
       <w:rFonts w:eastAsiaTheme="majorEastAsia" w:cstheme="majorBidi"/>
       <w:color w:val="595959" w:themeColor="text1" w:themeTint="A6"/>
@@ -5810,14 +5118,14 @@
       <w:szCs w:val="28"/>
     </w:rPr>
   </w:style>
-  <w:style w:type="paragraph" w:styleId="Citation">
+  <w:style w:type="paragraph" w:styleId="Quote">
     <w:name w:val="Quote"/>
     <w:basedOn w:val="Normal"/>
     <w:next w:val="Normal"/>
-    <w:link w:val="CitationCar"/>
+    <w:link w:val="QuoteChar"/>
     <w:uiPriority w:val="29"/>
     <w:qFormat/>
-    <w:rsid w:val="00C72654"/>
+    <w:rsid w:val="002D391C"/>
     <w:pPr>
       <w:spacing w:before="160"/>
       <w:jc w:val="center"/>
@@ -5828,19 +5136,19 @@
       <w:color w:val="404040" w:themeColor="text1" w:themeTint="BF"/>
     </w:rPr>
   </w:style>
-  <w:style w:type="character" w:customStyle="1" w:styleId="CitationCar">
-    <w:name w:val="Citation Car"/>
-    <w:basedOn w:val="Policepardfaut"/>
-    <w:link w:val="Citation"/>
+  <w:style w:type="character" w:customStyle="1" w:styleId="QuoteChar">
+    <w:name w:val="Quote Char"/>
+    <w:basedOn w:val="DefaultParagraphFont"/>
+    <w:link w:val="Quote"/>
     <w:uiPriority w:val="29"/>
-    <w:rsid w:val="00C72654"/>
+    <w:rsid w:val="002D391C"/>
     <w:rPr>
       <w:i/>
       <w:iCs/>
       <w:color w:val="404040" w:themeColor="text1" w:themeTint="BF"/>
     </w:rPr>
   </w:style>
-  <w:style w:type="paragraph" w:styleId="Paragraphedeliste">
+  <w:style w:type="paragraph" w:styleId="ListParagraph">
     <w:name w:val="List Paragraph"/>
     <w:basedOn w:val="Normal"/>
     <w:uiPriority w:val="34"/>
@@ -5851,26 +5159,26 @@
       <w:contextualSpacing/>
     </w:pPr>
   </w:style>
-  <w:style w:type="character" w:styleId="Accentuationintense">
+  <w:style w:type="character" w:styleId="IntenseEmphasis">
     <w:name w:val="Intense Emphasis"/>
-    <w:basedOn w:val="Policepardfaut"/>
+    <w:basedOn w:val="DefaultParagraphFont"/>
     <w:uiPriority w:val="21"/>
     <w:qFormat/>
-    <w:rsid w:val="00C72654"/>
+    <w:rsid w:val="002D391C"/>
     <w:rPr>
       <w:i/>
       <w:iCs/>
       <w:color w:val="0F4761" w:themeColor="accent1" w:themeShade="BF"/>
     </w:rPr>
   </w:style>
-  <w:style w:type="paragraph" w:styleId="Citationintense">
+  <w:style w:type="paragraph" w:styleId="IntenseQuote">
     <w:name w:val="Intense Quote"/>
     <w:basedOn w:val="Normal"/>
     <w:next w:val="Normal"/>
-    <w:link w:val="CitationintenseCar"/>
+    <w:link w:val="IntenseQuoteChar"/>
     <w:uiPriority w:val="30"/>
     <w:qFormat/>
-    <w:rsid w:val="00C72654"/>
+    <w:rsid w:val="002D391C"/>
     <w:pPr>
       <w:pBdr>
         <w:top w:val="single" w:sz="4" w:space="10" w:color="0F4761" w:themeColor="accent1" w:themeShade="BF"/>
@@ -5886,24 +5194,24 @@
       <w:color w:val="0F4761" w:themeColor="accent1" w:themeShade="BF"/>
     </w:rPr>
   </w:style>
-  <w:style w:type="character" w:customStyle="1" w:styleId="CitationintenseCar">
-    <w:name w:val="Citation intense Car"/>
-    <w:basedOn w:val="Policepardfaut"/>
-    <w:link w:val="Citationintense"/>
+  <w:style w:type="character" w:customStyle="1" w:styleId="IntenseQuoteChar">
+    <w:name w:val="Intense Quote Char"/>
+    <w:basedOn w:val="DefaultParagraphFont"/>
+    <w:link w:val="IntenseQuote"/>
     <w:uiPriority w:val="30"/>
-    <w:rsid w:val="00C72654"/>
+    <w:rsid w:val="002D391C"/>
     <w:rPr>
       <w:i/>
       <w:iCs/>
       <w:color w:val="0F4761" w:themeColor="accent1" w:themeShade="BF"/>
     </w:rPr>
   </w:style>
-  <w:style w:type="character" w:styleId="Rfrenceintense">
+  <w:style w:type="character" w:styleId="IntenseReference">
     <w:name w:val="Intense Reference"/>
-    <w:basedOn w:val="Policepardfaut"/>
+    <w:basedOn w:val="DefaultParagraphFont"/>
     <w:uiPriority w:val="32"/>
     <w:qFormat/>
-    <w:rsid w:val="00C72654"/>
+    <w:rsid w:val="002D391C"/>
     <w:rPr>
       <w:b/>
       <w:bCs/>
@@ -5912,56 +5220,41 @@
       <w:spacing w:val="5"/>
     </w:rPr>
   </w:style>
-  <w:style w:type="paragraph" w:styleId="Sansinterligne">
+  <w:style w:type="paragraph" w:styleId="NoSpacing">
     <w:name w:val="No Spacing"/>
-    <w:link w:val="SansinterligneCar"/>
+    <w:link w:val="NoSpacingChar"/>
     <w:uiPriority w:val="1"/>
     <w:qFormat/>
-    <w:rsid w:val="00C72654"/>
+    <w:rsid w:val="002D391C"/>
     <w:pPr>
       <w:spacing w:after="0" w:line="240" w:lineRule="auto"/>
     </w:pPr>
-    <w:rPr>
-      <w:rFonts w:eastAsiaTheme="minorEastAsia"/>
-      <w:kern w:val="0"/>
-      <w:lang w:eastAsia="fr-CH"/>
-      <w14:ligatures w14:val="none"/>
-    </w:rPr>
   </w:style>
-  <w:style w:type="character" w:customStyle="1" w:styleId="SansinterligneCar">
-    <w:name w:val="Sans interligne Car"/>
-    <w:basedOn w:val="Policepardfaut"/>
-    <w:link w:val="Sansinterligne"/>
+  <w:style w:type="character" w:customStyle="1" w:styleId="NoSpacingChar">
+    <w:name w:val="No Spacing Char"/>
+    <w:basedOn w:val="DefaultParagraphFont"/>
+    <w:link w:val="NoSpacing"/>
     <w:uiPriority w:val="1"/>
     <w:rsid w:val="00C72654"/>
-    <w:rPr>
-      <w:rFonts w:eastAsiaTheme="minorEastAsia"/>
-      <w:kern w:val="0"/>
-      <w:lang w:eastAsia="fr-CH"/>
-      <w14:ligatures w14:val="none"/>
-    </w:rPr>
   </w:style>
-  <w:style w:type="paragraph" w:styleId="En-ttedetabledesmatires">
+  <w:style w:type="paragraph" w:styleId="TOCHeading">
     <w:name w:val="TOC Heading"/>
-    <w:basedOn w:val="Titre1"/>
+    <w:basedOn w:val="Heading1"/>
     <w:next w:val="Normal"/>
     <w:uiPriority w:val="39"/>
     <w:unhideWhenUsed/>
     <w:qFormat/>
-    <w:rsid w:val="00DB0D28"/>
+    <w:rsid w:val="002D391C"/>
     <w:pPr>
-      <w:spacing w:after="0"/>
+      <w:spacing w:before="240" w:after="0"/>
       <w:outlineLvl w:val="9"/>
     </w:pPr>
     <w:rPr>
-      <w:kern w:val="0"/>
       <w:sz w:val="32"/>
       <w:szCs w:val="32"/>
-      <w:lang w:eastAsia="fr-CH"/>
-      <w14:ligatures w14:val="none"/>
     </w:rPr>
   </w:style>
-  <w:style w:type="paragraph" w:styleId="TM1">
+  <w:style w:type="paragraph" w:styleId="TOC1">
     <w:name w:val="toc 1"/>
     <w:basedOn w:val="Normal"/>
     <w:next w:val="Normal"/>
@@ -5973,9 +5266,9 @@
       <w:spacing w:after="100"/>
     </w:pPr>
   </w:style>
-  <w:style w:type="character" w:styleId="Lienhypertexte">
+  <w:style w:type="character" w:styleId="Hyperlink">
     <w:name w:val="Hyperlink"/>
-    <w:basedOn w:val="Policepardfaut"/>
+    <w:basedOn w:val="DefaultParagraphFont"/>
     <w:uiPriority w:val="99"/>
     <w:unhideWhenUsed/>
     <w:rsid w:val="00EB7F4E"/>
@@ -5984,10 +5277,10 @@
       <w:u w:val="single"/>
     </w:rPr>
   </w:style>
-  <w:style w:type="paragraph" w:styleId="En-tte">
+  <w:style w:type="paragraph" w:styleId="Header">
     <w:name w:val="header"/>
     <w:basedOn w:val="Normal"/>
-    <w:link w:val="En-tteCar"/>
+    <w:link w:val="HeaderChar"/>
     <w:uiPriority w:val="99"/>
     <w:unhideWhenUsed/>
     <w:rsid w:val="00991A56"/>
@@ -5999,10 +5292,10 @@
       <w:spacing w:after="0" w:line="240" w:lineRule="auto"/>
     </w:pPr>
   </w:style>
-  <w:style w:type="character" w:customStyle="1" w:styleId="En-tteCar">
-    <w:name w:val="En-tête Car"/>
-    <w:basedOn w:val="Policepardfaut"/>
-    <w:link w:val="En-tte"/>
+  <w:style w:type="character" w:customStyle="1" w:styleId="HeaderChar">
+    <w:name w:val="Header Char"/>
+    <w:basedOn w:val="DefaultParagraphFont"/>
+    <w:link w:val="Header"/>
     <w:uiPriority w:val="99"/>
     <w:rsid w:val="00991A56"/>
     <w:rPr>
@@ -6010,10 +5303,10 @@
       <w:lang w:val="en-US"/>
     </w:rPr>
   </w:style>
-  <w:style w:type="paragraph" w:styleId="Pieddepage">
+  <w:style w:type="paragraph" w:styleId="Footer">
     <w:name w:val="footer"/>
     <w:basedOn w:val="Normal"/>
-    <w:link w:val="PieddepageCar"/>
+    <w:link w:val="FooterChar"/>
     <w:uiPriority w:val="99"/>
     <w:unhideWhenUsed/>
     <w:rsid w:val="00991A56"/>
@@ -6025,10 +5318,10 @@
       <w:spacing w:after="0" w:line="240" w:lineRule="auto"/>
     </w:pPr>
   </w:style>
-  <w:style w:type="character" w:customStyle="1" w:styleId="PieddepageCar">
-    <w:name w:val="Pied de page Car"/>
-    <w:basedOn w:val="Policepardfaut"/>
-    <w:link w:val="Pieddepage"/>
+  <w:style w:type="character" w:customStyle="1" w:styleId="FooterChar">
+    <w:name w:val="Footer Char"/>
+    <w:basedOn w:val="DefaultParagraphFont"/>
+    <w:link w:val="Footer"/>
     <w:uiPriority w:val="99"/>
     <w:rsid w:val="00991A56"/>
     <w:rPr>
@@ -6046,7 +5339,85 @@
     <w:rPr>
       <w:rFonts w:ascii="Times New Roman" w:hAnsi="Times New Roman" w:cs="Times New Roman"/>
       <w:sz w:val="24"/>
-      <w:szCs w:val="24"/>
+    </w:rPr>
+  </w:style>
+  <w:style w:type="paragraph" w:styleId="Caption">
+    <w:name w:val="caption"/>
+    <w:basedOn w:val="Normal"/>
+    <w:next w:val="Normal"/>
+    <w:uiPriority w:val="35"/>
+    <w:semiHidden/>
+    <w:unhideWhenUsed/>
+    <w:qFormat/>
+    <w:rsid w:val="002D391C"/>
+    <w:pPr>
+      <w:spacing w:after="200" w:line="240" w:lineRule="auto"/>
+    </w:pPr>
+    <w:rPr>
+      <w:i/>
+      <w:iCs/>
+      <w:color w:val="0E2841" w:themeColor="text2"/>
+      <w:sz w:val="18"/>
+      <w:szCs w:val="18"/>
+    </w:rPr>
+  </w:style>
+  <w:style w:type="character" w:styleId="Strong">
+    <w:name w:val="Strong"/>
+    <w:basedOn w:val="DefaultParagraphFont"/>
+    <w:uiPriority w:val="22"/>
+    <w:qFormat/>
+    <w:rsid w:val="002D391C"/>
+    <w:rPr>
+      <w:b/>
+      <w:bCs/>
+    </w:rPr>
+  </w:style>
+  <w:style w:type="character" w:styleId="Emphasis">
+    <w:name w:val="Emphasis"/>
+    <w:basedOn w:val="DefaultParagraphFont"/>
+    <w:uiPriority w:val="20"/>
+    <w:qFormat/>
+    <w:rsid w:val="002D391C"/>
+    <w:rPr>
+      <w:i/>
+      <w:iCs/>
+    </w:rPr>
+  </w:style>
+  <w:style w:type="character" w:styleId="SubtleEmphasis">
+    <w:name w:val="Subtle Emphasis"/>
+    <w:basedOn w:val="DefaultParagraphFont"/>
+    <w:uiPriority w:val="19"/>
+    <w:qFormat/>
+    <w:rsid w:val="002D391C"/>
+    <w:rPr>
+      <w:i/>
+      <w:iCs/>
+      <w:color w:val="404040" w:themeColor="text1" w:themeTint="BF"/>
+    </w:rPr>
+  </w:style>
+  <w:style w:type="character" w:styleId="SubtleReference">
+    <w:name w:val="Subtle Reference"/>
+    <w:basedOn w:val="DefaultParagraphFont"/>
+    <w:uiPriority w:val="31"/>
+    <w:qFormat/>
+    <w:rsid w:val="002D391C"/>
+    <w:rPr>
+      <w:smallCaps/>
+      <w:color w:val="5A5A5A" w:themeColor="text1" w:themeTint="A5"/>
+    </w:rPr>
+  </w:style>
+  <w:style w:type="character" w:styleId="BookTitle">
+    <w:name w:val="Book Title"/>
+    <w:basedOn w:val="DefaultParagraphFont"/>
+    <w:uiPriority w:val="33"/>
+    <w:qFormat/>
+    <w:rsid w:val="002D391C"/>
+    <w:rPr>
+      <w:b/>
+      <w:bCs/>
+      <w:i/>
+      <w:iCs/>
+      <w:spacing w:val="5"/>
     </w:rPr>
   </w:style>
 </w:styles>
@@ -6222,12 +5593,6 @@
     <w:pitch w:val="variable"/>
     <w:sig w:usb0="00000000" w:usb1="10000000" w:usb2="00000000" w:usb3="00000000" w:csb0="80000000" w:csb1="00000000"/>
   </w:font>
-  <w:font w:name="Segoe Pro">
-    <w:charset w:val="00"/>
-    <w:family w:val="swiss"/>
-    <w:pitch w:val="variable"/>
-    <w:sig w:usb0="A00002AF" w:usb1="4000205B" w:usb2="00000000" w:usb3="00000000" w:csb0="0000009F" w:csb1="00000000"/>
-  </w:font>
   <w:font w:name="Aptos Display">
     <w:charset w:val="00"/>
     <w:family w:val="swiss"/>
@@ -6260,9 +5625,11 @@
     <w:rsid w:val="002A33B0"/>
     <w:rsid w:val="004F5C9B"/>
     <w:rsid w:val="00640585"/>
+    <w:rsid w:val="00773269"/>
     <w:rsid w:val="007F7BDB"/>
     <w:rsid w:val="00AD4CC4"/>
     <w:rsid w:val="00B17563"/>
+    <w:rsid w:val="00B74A57"/>
     <w:rsid w:val="00C10096"/>
     <w:rsid w:val="00D25AA3"/>
     <w:rsid w:val="00D94B18"/>
@@ -6284,8 +5651,8 @@
   </m:mathPr>
   <w:themeFontLang w:val="fr-CH"/>
   <w:clrSchemeMapping w:bg1="light1" w:t1="dark1" w:bg2="light2" w:t2="dark2" w:accent1="accent1" w:accent2="accent2" w:accent3="accent3" w:accent4="accent4" w:accent5="accent5" w:accent6="accent6" w:hyperlink="hyperlink" w:followedHyperlink="followedHyperlink"/>
-  <w:decimalSymbol w:val=","/>
-  <w:listSeparator w:val=";"/>
+  <w:decimalSymbol w:val="."/>
+  <w:listSeparator w:val=","/>
   <w15:chartTrackingRefBased/>
 </w:settings>
 </file>
@@ -6691,13 +6058,13 @@
     <w:name w:val="Normal"/>
     <w:qFormat/>
   </w:style>
-  <w:style w:type="character" w:default="1" w:styleId="Policepardfaut">
+  <w:style w:type="character" w:default="1" w:styleId="DefaultParagraphFont">
     <w:name w:val="Default Paragraph Font"/>
     <w:uiPriority w:val="1"/>
     <w:semiHidden/>
     <w:unhideWhenUsed/>
   </w:style>
-  <w:style w:type="table" w:default="1" w:styleId="TableauNormal">
+  <w:style w:type="table" w:default="1" w:styleId="TableNormal">
     <w:name w:val="Normal Table"/>
     <w:uiPriority w:val="99"/>
     <w:semiHidden/>
@@ -6712,7 +6079,7 @@
       </w:tblCellMar>
     </w:tblPr>
   </w:style>
-  <w:style w:type="numbering" w:default="1" w:styleId="Aucuneliste">
+  <w:style w:type="numbering" w:default="1" w:styleId="NoList">
     <w:name w:val="No List"/>
     <w:uiPriority w:val="99"/>
     <w:semiHidden/>

</xml_diff>